<commit_message>
Proyecto Integrador 2026-2: sustentacion 15+5 min, plazo unico 15/11 11:59 p. m. y entrega en un .zip con enlace en los cinco cursos
Co-Authored-By: Claude Opus 5.5 <noreply@anthropic.com>
</commit_message>
<xml_diff>
--- a/Arquitectura de Sistemas Computacionales/Clases/Proyecto Integrador/Enunciado Proyecto Integrador - Arquitectura de Sistemas Computacionales - 2026-2.docx
+++ b/Arquitectura de Sistemas Computacionales/Clases/Proyecto Integrador/Enunciado Proyecto Integrador - Arquitectura de Sistemas Computacionales - 2026-2.docx
@@ -121,7 +121,7 @@
           <w:color w:val="095292"/>
           <w:sz w:val="20"/>
         </w:rPr>
-        <w:t>Versión estudiante — Entrega en la plataforma del curso según hitos del plan.</w:t>
+        <w:t>Versión estudiante — Entrega final en la plataforma del curso: dom 15/11/2026, 11:59 p. m.</w:t>
       </w:r>
     </w:p>
     <w:p>
@@ -361,7 +361,7 @@
           <w:color w:val="2B2B2B"/>
           <w:sz w:val="22"/>
         </w:rPr>
-        <w:t>Presentación de sustentación (5–8 min) con demo de diagrama + lab.</w:t>
+        <w:t>Sustentación en vivo en la última clase: 15 minutos de exposición + 5 minutos de preguntas (turno de 20 minutos), con demo de diagrama + lab.</w:t>
       </w:r>
     </w:p>
     <w:p>
@@ -674,7 +674,7 @@
                 <w:color w:val="2B2B2B"/>
                 <w:sz w:val="20"/>
               </w:rPr>
-              <w:t>Diagramas v1 + checklist · escenario de prueba y métricas objetivo (cierre: domingo 01/11 23:59)</w:t>
+              <w:t>Diagramas v1 + checklist · escenario de prueba y métricas objetivo (cierre: domingo 01/11, 11:59 p. m.)</w:t>
             </w:r>
           </w:p>
         </w:tc>
@@ -748,7 +748,7 @@
                 <w:color w:val="2B2B2B"/>
                 <w:sz w:val="20"/>
               </w:rPr>
-              <w:t>Sección de autoescalado del informe (cierre: domingo 08/11 23:59)</w:t>
+              <w:t>Sección de autoescalado del informe (cierre: domingo 08/11, 11:59 p. m.)</w:t>
             </w:r>
           </w:p>
         </w:tc>
@@ -767,7 +767,7 @@
                 <w:color w:val="2B2B2B"/>
                 <w:sz w:val="20"/>
               </w:rPr>
-              <w:t>Parcial 3 · paquete final</w:t>
+              <w:t>Parcial 3</w:t>
             </w:r>
           </w:p>
         </w:tc>
@@ -818,7 +818,7 @@
                 <w:color w:val="2B2B2B"/>
                 <w:sz w:val="20"/>
               </w:rPr>
-              <w:t>Día de parcial = solo evaluación (virtual síncrona por Meet). El paquete final cierra el domingo 15/11 23:59; el ensayo y la preparación fueron en la Sesión 10 (Clase 12)</w:t>
+              <w:t>Día de parcial = solo evaluación (virtual síncrona por Meet); el ensayo y la preparación fueron en la Sesión 10 (Clase 12)</w:t>
             </w:r>
           </w:p>
         </w:tc>
@@ -838,7 +838,7 @@
                 <w:color w:val="2B2B2B"/>
                 <w:sz w:val="20"/>
               </w:rPr>
-              <w:t>Sustentación / cierre</w:t>
+              <w:t>Entrega final del PI</w:t>
             </w:r>
           </w:p>
         </w:tc>
@@ -856,7 +856,7 @@
                 <w:color w:val="2B2B2B"/>
                 <w:sz w:val="20"/>
               </w:rPr>
-              <w:t>Sesión 13 (Clase 15)</w:t>
+              <w:t>—</w:t>
             </w:r>
           </w:p>
         </w:tc>
@@ -874,7 +874,7 @@
                 <w:color w:val="2B2B2B"/>
                 <w:sz w:val="20"/>
               </w:rPr>
-              <w:t>16/11/2026</w:t>
+              <w:t>15/11/2026</w:t>
             </w:r>
           </w:p>
         </w:tc>
@@ -892,7 +892,77 @@
                 <w:color w:val="2B2B2B"/>
                 <w:sz w:val="20"/>
               </w:rPr>
-              <w:t>Defensa en vivo del PI CloudLite + cierre del curso</w:t>
+              <w:t>Plazo único: domingo, 11:59 p. m. Un .zip + el enlace al repositorio o a la carpeta de Drive</w:t>
+            </w:r>
+          </w:p>
+        </w:tc>
+      </w:tr>
+      <w:tr>
+        <w:tc>
+          <w:tcPr>
+            <w:tcW w:type="dxa" w:w="2448"/>
+          </w:tcPr>
+          <w:p>
+            <w:r/>
+            <w:r>
+              <w:rPr>
+                <w:rFonts w:ascii="Calibri" w:hAnsi="Calibri" w:eastAsia="Calibri"/>
+                <w:b w:val="0"/>
+                <w:color w:val="2B2B2B"/>
+                <w:sz w:val="20"/>
+              </w:rPr>
+              <w:t>Sustentación / cierre</w:t>
+            </w:r>
+          </w:p>
+        </w:tc>
+        <w:tc>
+          <w:tcPr>
+            <w:tcW w:type="dxa" w:w="2448"/>
+          </w:tcPr>
+          <w:p>
+            <w:r/>
+            <w:r>
+              <w:rPr>
+                <w:rFonts w:ascii="Calibri" w:hAnsi="Calibri" w:eastAsia="Calibri"/>
+                <w:b w:val="0"/>
+                <w:color w:val="2B2B2B"/>
+                <w:sz w:val="20"/>
+              </w:rPr>
+              <w:t>Sesión 13 (Clase 15)</w:t>
+            </w:r>
+          </w:p>
+        </w:tc>
+        <w:tc>
+          <w:tcPr>
+            <w:tcW w:type="dxa" w:w="2448"/>
+          </w:tcPr>
+          <w:p>
+            <w:r/>
+            <w:r>
+              <w:rPr>
+                <w:rFonts w:ascii="Calibri" w:hAnsi="Calibri" w:eastAsia="Calibri"/>
+                <w:b w:val="0"/>
+                <w:color w:val="2B2B2B"/>
+                <w:sz w:val="20"/>
+              </w:rPr>
+              <w:t>16/11/2026</w:t>
+            </w:r>
+          </w:p>
+        </w:tc>
+        <w:tc>
+          <w:tcPr>
+            <w:tcW w:type="dxa" w:w="2448"/>
+          </w:tcPr>
+          <w:p>
+            <w:r/>
+            <w:r>
+              <w:rPr>
+                <w:rFonts w:ascii="Calibri" w:hAnsi="Calibri" w:eastAsia="Calibri"/>
+                <w:b w:val="0"/>
+                <w:color w:val="2B2B2B"/>
+                <w:sz w:val="20"/>
+              </w:rPr>
+              <w:t>Defensa en vivo del PI CloudLite (15 min + 5 de preguntas) + cierre del curso</w:t>
             </w:r>
           </w:p>
         </w:tc>
@@ -991,7 +1061,7 @@
           <w:color w:val="2B2B2B"/>
           <w:sz w:val="22"/>
         </w:rPr>
-        <w:t>Entregas: documento propio → subir a la plataforma del curso.</w:t>
+        <w:t>Entrega: documento propio, dentro del .zip que se sube a la plataforma del curso.</w:t>
       </w:r>
     </w:p>
     <w:p>
@@ -1561,6 +1631,141 @@
         <w:t>No se pide producción real en Internet: el foco es diseño + simulación en labs gratis.</w:t>
       </w:r>
     </w:p>
+    <w:p>
+      <w:pPr>
+        <w:spacing w:after="120" w:before="240"/>
+        <w:jc w:val="left"/>
+      </w:pPr>
+      <w:r>
+        <w:rPr>
+          <w:rFonts w:ascii="Calibri" w:hAnsi="Calibri" w:eastAsia="Calibri"/>
+          <w:b/>
+          <w:color w:val="095292"/>
+          <w:sz w:val="24"/>
+        </w:rPr>
+        <w:t>9. Entrega y sustentación</w:t>
+      </w:r>
+    </w:p>
+    <w:p>
+      <w:pPr>
+        <w:pStyle w:val="ListBullet"/>
+        <w:spacing w:after="40"/>
+      </w:pPr>
+      <w:r>
+        <w:rPr>
+          <w:rFonts w:ascii="Calibri" w:hAnsi="Calibri" w:eastAsia="Calibri"/>
+          <w:b/>
+          <w:color w:val="2B2B2B"/>
+          <w:sz w:val="22"/>
+        </w:rPr>
+        <w:t>Plazo único:</w:t>
+      </w:r>
+      <w:r>
+        <w:rPr>
+          <w:rFonts w:ascii="Calibri" w:hAnsi="Calibri" w:eastAsia="Calibri"/>
+          <w:b w:val="0"/>
+          <w:color w:val="2B2B2B"/>
+          <w:sz w:val="22"/>
+        </w:rPr>
+        <w:t xml:space="preserve"> domingo 15 de noviembre de 2026, 11:59 p. m., en la plataforma del curso.</w:t>
+      </w:r>
+    </w:p>
+    <w:p>
+      <w:pPr>
+        <w:pStyle w:val="ListBullet"/>
+        <w:spacing w:after="40"/>
+      </w:pPr>
+      <w:r>
+        <w:rPr>
+          <w:rFonts w:ascii="Calibri" w:hAnsi="Calibri" w:eastAsia="Calibri"/>
+          <w:b/>
+          <w:color w:val="2B2B2B"/>
+          <w:sz w:val="22"/>
+        </w:rPr>
+        <w:t>Qué se sube:</w:t>
+      </w:r>
+      <w:r>
+        <w:rPr>
+          <w:rFonts w:ascii="Calibri" w:hAnsi="Calibri" w:eastAsia="Calibri"/>
+          <w:b w:val="0"/>
+          <w:color w:val="2B2B2B"/>
+          <w:sz w:val="22"/>
+        </w:rPr>
+        <w:t xml:space="preserve"> un solo archivo .zip con todo —código, documentos, diagramas y capturas—; dentro puede ir cualquier tipo de archivo, y pesa como máximo 50 MB.</w:t>
+      </w:r>
+    </w:p>
+    <w:p>
+      <w:pPr>
+        <w:pStyle w:val="ListBullet"/>
+        <w:spacing w:after="40"/>
+      </w:pPr>
+      <w:r>
+        <w:rPr>
+          <w:rFonts w:ascii="Calibri" w:hAnsi="Calibri" w:eastAsia="Calibri"/>
+          <w:b/>
+          <w:color w:val="2B2B2B"/>
+          <w:sz w:val="22"/>
+        </w:rPr>
+        <w:t>Enlace obligatorio:</w:t>
+      </w:r>
+      <w:r>
+        <w:rPr>
+          <w:rFonts w:ascii="Calibri" w:hAnsi="Calibri" w:eastAsia="Calibri"/>
+          <w:b w:val="0"/>
+          <w:color w:val="2B2B2B"/>
+          <w:sz w:val="22"/>
+        </w:rPr>
+        <w:t xml:space="preserve"> junto al .zip va el enlace al repositorio de GitHub o a la carpeta de Drive del proyecto.</w:t>
+      </w:r>
+    </w:p>
+    <w:p>
+      <w:pPr>
+        <w:pStyle w:val="ListBullet"/>
+        <w:spacing w:after="40"/>
+      </w:pPr>
+      <w:r>
+        <w:rPr>
+          <w:rFonts w:ascii="Calibri" w:hAnsi="Calibri" w:eastAsia="Calibri"/>
+          <w:b/>
+          <w:color w:val="2B2B2B"/>
+          <w:sz w:val="22"/>
+        </w:rPr>
+        <w:t>Una sola entrega por estudiante,</w:t>
+      </w:r>
+      <w:r>
+        <w:rPr>
+          <w:rFonts w:ascii="Calibri" w:hAnsi="Calibri" w:eastAsia="Calibri"/>
+          <w:b w:val="0"/>
+          <w:color w:val="2B2B2B"/>
+          <w:sz w:val="22"/>
+        </w:rPr>
+        <w:t xml:space="preserve"> también si el docente autorizó trabajar en equipo.</w:t>
+      </w:r>
+    </w:p>
+    <w:p>
+      <w:pPr>
+        <w:pStyle w:val="ListBullet"/>
+        <w:spacing w:after="40"/>
+      </w:pPr>
+      <w:r>
+        <w:rPr>
+          <w:rFonts w:ascii="Calibri" w:hAnsi="Calibri" w:eastAsia="Calibri"/>
+          <w:b/>
+          <w:color w:val="2B2B2B"/>
+          <w:sz w:val="22"/>
+        </w:rPr>
+        <w:t>Sustentación:</w:t>
+      </w:r>
+      <w:r>
+        <w:rPr>
+          <w:rFonts w:ascii="Calibri" w:hAnsi="Calibri" w:eastAsia="Calibri"/>
+          <w:b w:val="0"/>
+          <w:color w:val="2B2B2B"/>
+          <w:sz w:val="22"/>
+        </w:rPr>
+        <w:t xml:space="preserve"> lunes 16/11/2026, en la última clase (sesión 13; es festivo, pero sí hay clase), por Meet: 15 minutos de exposición + 5 minutos de preguntas (turno de 20 minutos).</w:t>
+      </w:r>
+    </w:p>
     <w:sectPr>
       <w:pgSz w:w="12240" w:h="15840"/>
       <w:pgMar w:top="1008" w:right="1224" w:bottom="1008" w:left="1224" w:header="720" w:footer="720" w:gutter="0"/>

</xml_diff>

<commit_message>
Proyecto Integrador 2026-2: en equipo de 4 a 5 integrantes (maximo 5) en los cinco cursos, explicito en portada, modalidad y entrega
Co-Authored-By: Claude Opus 5.5 <noreply@anthropic.com>
</commit_message>
<xml_diff>
--- a/Arquitectura de Sistemas Computacionales/Clases/Proyecto Integrador/Enunciado Proyecto Integrador - Arquitectura de Sistemas Computacionales - 2026-2.docx
+++ b/Arquitectura de Sistemas Computacionales/Clases/Proyecto Integrador/Enunciado Proyecto Integrador - Arquitectura de Sistemas Computacionales - 2026-2.docx
@@ -110,7 +110,7 @@
     </w:p>
     <w:p>
       <w:pPr>
-        <w:spacing w:after="200" w:before="0"/>
+        <w:spacing w:after="80" w:before="0"/>
         <w:jc w:val="center"/>
         <w:shd w:val="clear" w:fill="E8F4FA"/>
       </w:pPr>
@@ -122,6 +122,22 @@
           <w:sz w:val="20"/>
         </w:rPr>
         <w:t>Versión estudiante — Entrega final en la plataforma del curso: dom 15/11/2026, 11:59 p. m.</w:t>
+      </w:r>
+    </w:p>
+    <w:p>
+      <w:pPr>
+        <w:spacing w:after="200" w:before="0"/>
+        <w:jc w:val="center"/>
+        <w:shd w:val="clear" w:fill="FFF8D6"/>
+      </w:pPr>
+      <w:r>
+        <w:rPr>
+          <w:rFonts w:ascii="Calibri" w:hAnsi="Calibri" w:eastAsia="Calibri"/>
+          <w:b/>
+          <w:color w:val="095292"/>
+          <w:sz w:val="22"/>
+        </w:rPr>
+        <w:t>Proyecto en equipo de 4 a 5 integrantes (máximo 5) — no es individual</w:t>
       </w:r>
     </w:p>
     <w:p>
@@ -167,6 +183,31 @@
           <w:sz w:val="22"/>
         </w:rPr>
         <w:t>Peso: 20% del Corte 3 (Acuerdo pedagógico). El Parcial 3 (15%) y la asistencia (5%) se evalúan por separado.</w:t>
+      </w:r>
+    </w:p>
+    <w:p>
+      <w:pPr>
+        <w:spacing w:after="160" w:before="0"/>
+        <w:jc w:val="left"/>
+        <w:shd w:val="clear" w:fill="FFF8D6"/>
+      </w:pPr>
+      <w:r>
+        <w:rPr>
+          <w:rFonts w:ascii="Calibri" w:hAnsi="Calibri" w:eastAsia="Calibri"/>
+          <w:b/>
+          <w:color w:val="2B2B2B"/>
+          <w:sz w:val="22"/>
+        </w:rPr>
+        <w:t>Modalidad: en equipo de 4 a 5 integrantes (máximo 5).</w:t>
+      </w:r>
+      <w:r>
+        <w:rPr>
+          <w:rFonts w:ascii="Calibri" w:hAnsi="Calibri" w:eastAsia="Calibri"/>
+          <w:b w:val="0"/>
+          <w:color w:val="2B2B2B"/>
+          <w:sz w:val="22"/>
+        </w:rPr>
+        <w:t xml:space="preserve"> Este semestre el proyecto no es individual: lo construye el equipo completo y lo sustentan todos sus integrantes.</w:t>
       </w:r>
     </w:p>
     <w:p>
@@ -361,7 +402,7 @@
           <w:color w:val="2B2B2B"/>
           <w:sz w:val="22"/>
         </w:rPr>
-        <w:t>Sustentación en vivo en la última clase: 15 minutos de exposición + 5 minutos de preguntas (turno de 20 minutos), con demo de diagrama + lab.</w:t>
+        <w:t>Sustentación en vivo en la última clase: 15 minutos de exposición + 5 minutos de preguntas por equipo (turno de 20 minutos); hablan todos los integrantes, con demo de diagrama + lab.</w:t>
       </w:r>
     </w:p>
     <w:p>
@@ -1519,11 +1560,20 @@
       <w:r>
         <w:rPr>
           <w:rFonts w:ascii="Calibri" w:hAnsi="Calibri" w:eastAsia="Calibri"/>
+          <w:b/>
+          <w:color w:val="2B2B2B"/>
+          <w:sz w:val="22"/>
+        </w:rPr>
+        <w:t>En equipo, no individual:</w:t>
+      </w:r>
+      <w:r>
+        <w:rPr>
+          <w:rFonts w:ascii="Calibri" w:hAnsi="Calibri" w:eastAsia="Calibri"/>
           <w:b w:val="0"/>
           <w:color w:val="2B2B2B"/>
           <w:sz w:val="22"/>
         </w:rPr>
-        <w:t>Individual por defecto: cada estudiante desarrolla y entrega su propio proyecto.</w:t>
+        <w:t xml:space="preserve"> equipos de 4 a 5 integrantes (máximo 5).</w:t>
       </w:r>
     </w:p>
     <w:p>
@@ -1538,7 +1588,7 @@
           <w:color w:val="2B2B2B"/>
           <w:sz w:val="22"/>
         </w:rPr>
-        <w:t>Opcional: el docente puede autorizar equipos de 2 o 3 integrantes.</w:t>
+        <w:t>Todo el equipo trabaja el proyecto completo: en la sustentación hablan todos, y cualquier integrante debe poder explicar los diagramas y el workflow CI/CD.</w:t>
       </w:r>
     </w:p>
     <w:p>
@@ -1553,22 +1603,7 @@
           <w:color w:val="2B2B2B"/>
           <w:sz w:val="22"/>
         </w:rPr>
-        <w:t>Debes poder explicar los diagramas y el workflow CI/CD (si hay equipo, cualquier integrante).</w:t>
-      </w:r>
-    </w:p>
-    <w:p>
-      <w:pPr>
-        <w:pStyle w:val="ListBullet"/>
-        <w:spacing w:after="40"/>
-      </w:pPr>
-      <w:r>
-        <w:rPr>
-          <w:rFonts w:ascii="Calibri" w:hAnsi="Calibri" w:eastAsia="Calibri"/>
-          <w:b w:val="0"/>
-          <w:color w:val="2B2B2B"/>
-          <w:sz w:val="22"/>
-        </w:rPr>
-        <w:t>La entrega es siempre individual, incluso si el artefacto se trabajó en equipo.</w:t>
+        <w:t>Cada integrante sube la entrega del equipo desde su propia cuenta (sección 9).</w:t>
       </w:r>
     </w:p>
     <w:p>
@@ -1730,7 +1765,7 @@
           <w:color w:val="2B2B2B"/>
           <w:sz w:val="22"/>
         </w:rPr>
-        <w:t>Una sola entrega por estudiante,</w:t>
+        <w:t>Cada integrante sube la entrega del equipo</w:t>
       </w:r>
       <w:r>
         <w:rPr>
@@ -1739,7 +1774,7 @@
           <w:color w:val="2B2B2B"/>
           <w:sz w:val="22"/>
         </w:rPr>
-        <w:t xml:space="preserve"> también si el docente autorizó trabajar en equipo.</w:t>
+        <w:t xml:space="preserve"> desde su propia cuenta: el mismo .zip y el mismo enlace; una sola entrega por estudiante.</w:t>
       </w:r>
     </w:p>
     <w:p>
@@ -1763,7 +1798,7 @@
           <w:color w:val="2B2B2B"/>
           <w:sz w:val="22"/>
         </w:rPr>
-        <w:t xml:space="preserve"> lunes 16/11/2026, en la última clase (sesión 13; es festivo, pero sí hay clase), por Meet: 15 minutos de exposición + 5 minutos de preguntas (turno de 20 minutos).</w:t>
+        <w:t xml:space="preserve"> lunes 16/11/2026, en la última clase (sesión 13; es festivo, pero sí hay clase), por Meet: 15 minutos de exposición + 5 minutos de preguntas por equipo (turno de 20 minutos); hablan todos los integrantes.</w:t>
       </w:r>
     </w:p>
     <w:sectPr>

</xml_diff>

<commit_message>
Proyecto Integrador 2026-2: el equipo de 4 a 5 integrantes es regla solo del proyecto, no de talleres ni demas entregables
Co-Authored-By: Claude Opus 5.5 <noreply@anthropic.com>
</commit_message>
<xml_diff>
--- a/Arquitectura de Sistemas Computacionales/Clases/Proyecto Integrador/Enunciado Proyecto Integrador - Arquitectura de Sistemas Computacionales - 2026-2.docx
+++ b/Arquitectura de Sistemas Computacionales/Clases/Proyecto Integrador/Enunciado Proyecto Integrador - Arquitectura de Sistemas Computacionales - 2026-2.docx
@@ -198,7 +198,7 @@
           <w:color w:val="2B2B2B"/>
           <w:sz w:val="22"/>
         </w:rPr>
-        <w:t>Modalidad: en equipo de 4 a 5 integrantes (máximo 5).</w:t>
+        <w:t>Modalidad del proyecto: en equipo de 4 a 5 integrantes (máximo 5).</w:t>
       </w:r>
       <w:r>
         <w:rPr>
@@ -207,7 +207,7 @@
           <w:color w:val="2B2B2B"/>
           <w:sz w:val="22"/>
         </w:rPr>
-        <w:t xml:space="preserve"> Este semestre el proyecto no es individual: lo construye el equipo completo y lo sustentan todos sus integrantes.</w:t>
+        <w:t xml:space="preserve"> Este semestre el Proyecto Integrador no es individual: lo construye el equipo completo y lo sustentan todos sus integrantes. Esta regla es solo para el proyecto: talleres, quices, parciales y demás entregables mantienen la modalidad que se indique en cada uno.</w:t>
       </w:r>
     </w:p>
     <w:p>

</xml_diff>

<commit_message>
Proyecto Integrador 2026-2: entrega especifica por curso y enunciado de Introduccion detallado con el prototipo sin programar
Co-Authored-By: Claude Opus 5.5 <noreply@anthropic.com>
</commit_message>
<xml_diff>
--- a/Arquitectura de Sistemas Computacionales/Clases/Proyecto Integrador/Enunciado Proyecto Integrador - Arquitectura de Sistemas Computacionales - 2026-2.docx
+++ b/Arquitectura de Sistemas Computacionales/Clases/Proyecto Integrador/Enunciado Proyecto Integrador - Arquitectura de Sistemas Computacionales - 2026-2.docx
@@ -1726,8 +1726,212 @@
           <w:color w:val="2B2B2B"/>
           <w:sz w:val="22"/>
         </w:rPr>
-        <w:t xml:space="preserve"> un solo archivo .zip con todo —código, documentos, diagramas y capturas—; dentro puede ir cualquier tipo de archivo, y pesa como máximo 50 MB.</w:t>
+        <w:t xml:space="preserve"> un solo archivo .zip —dentro puede ir cualquier tipo de archivo; máximo 50 MB—, con esto adentro:</w:t>
       </w:r>
+    </w:p>
+    <w:tbl>
+      <w:tblPr>
+        <w:tblStyle w:val="TableGrid"/>
+        <w:tblW w:type="auto" w:w="0"/>
+        <w:tblLayout w:type="fixed"/>
+        <w:tblLook w:firstColumn="1" w:firstRow="1" w:lastColumn="0" w:lastRow="0" w:noHBand="0" w:noVBand="1" w:val="04A0"/>
+      </w:tblPr>
+      <w:tblGrid>
+        <w:gridCol w:w="4896"/>
+        <w:gridCol w:w="4896"/>
+      </w:tblGrid>
+      <w:tr>
+        <w:tc>
+          <w:tcPr>
+            <w:tcW w:type="dxa" w:w="2448"/>
+            <w:shd w:val="clear" w:fill="095292"/>
+          </w:tcPr>
+          <w:p>
+            <w:r/>
+            <w:r>
+              <w:rPr>
+                <w:rFonts w:ascii="Calibri" w:hAnsi="Calibri" w:eastAsia="Calibri"/>
+                <w:b/>
+                <w:color w:val="FFFFFF"/>
+                <w:sz w:val="20"/>
+              </w:rPr>
+              <w:t>En el .zip</w:t>
+            </w:r>
+          </w:p>
+        </w:tc>
+        <w:tc>
+          <w:tcPr>
+            <w:tcW w:type="dxa" w:w="7344"/>
+            <w:shd w:val="clear" w:fill="095292"/>
+          </w:tcPr>
+          <w:p>
+            <w:r/>
+            <w:r>
+              <w:rPr>
+                <w:rFonts w:ascii="Calibri" w:hAnsi="Calibri" w:eastAsia="Calibri"/>
+                <w:b/>
+                <w:color w:val="FFFFFF"/>
+                <w:sz w:val="20"/>
+              </w:rPr>
+              <w:t>Qué contiene</w:t>
+            </w:r>
+          </w:p>
+        </w:tc>
+      </w:tr>
+      <w:tr>
+        <w:tc>
+          <w:tcPr>
+            <w:tcW w:type="dxa" w:w="2448"/>
+          </w:tcPr>
+          <w:p>
+            <w:r/>
+            <w:r>
+              <w:rPr>
+                <w:rFonts w:ascii="Calibri" w:hAnsi="Calibri" w:eastAsia="Calibri"/>
+                <w:b w:val="0"/>
+                <w:color w:val="2B2B2B"/>
+                <w:sz w:val="20"/>
+              </w:rPr>
+              <w:t>Documento de arquitectura</w:t>
+            </w:r>
+          </w:p>
+        </w:tc>
+        <w:tc>
+          <w:tcPr>
+            <w:tcW w:type="dxa" w:w="7344"/>
+          </w:tcPr>
+          <w:p>
+            <w:r/>
+            <w:r>
+              <w:rPr>
+                <w:rFonts w:ascii="Calibri" w:hAnsi="Calibri" w:eastAsia="Calibri"/>
+                <w:b w:val="0"/>
+                <w:color w:val="2B2B2B"/>
+                <w:sz w:val="20"/>
+              </w:rPr>
+              <w:t>PDF o DOCX: contexto, ADRs breves, riesgos, costos estimados en lenguaje cualitativo y las secciones de seguridad, monitoreo, rendimiento y escalabilidad.</w:t>
+            </w:r>
+          </w:p>
+        </w:tc>
+      </w:tr>
+      <w:tr>
+        <w:tc>
+          <w:tcPr>
+            <w:tcW w:type="dxa" w:w="2448"/>
+            <w:shd w:val="clear" w:fill="F2F2F2"/>
+          </w:tcPr>
+          <w:p>
+            <w:r/>
+            <w:r>
+              <w:rPr>
+                <w:rFonts w:ascii="Calibri" w:hAnsi="Calibri" w:eastAsia="Calibri"/>
+                <w:b w:val="0"/>
+                <w:color w:val="2B2B2B"/>
+                <w:sz w:val="20"/>
+              </w:rPr>
+              <w:t>diagramas/</w:t>
+            </w:r>
+          </w:p>
+        </w:tc>
+        <w:tc>
+          <w:tcPr>
+            <w:tcW w:type="dxa" w:w="7344"/>
+            <w:shd w:val="clear" w:fill="F2F2F2"/>
+          </w:tcPr>
+          <w:p>
+            <w:r/>
+            <w:r>
+              <w:rPr>
+                <w:rFonts w:ascii="Calibri" w:hAnsi="Calibri" w:eastAsia="Calibri"/>
+                <w:b w:val="0"/>
+                <w:color w:val="2B2B2B"/>
+                <w:sz w:val="20"/>
+              </w:rPr>
+              <w:t>Componentes (C4), despliegue y flujo CI/CD, exportados en PNG, con su archivo fuente (.drawio o el texto Mermaid).</w:t>
+            </w:r>
+          </w:p>
+        </w:tc>
+      </w:tr>
+      <w:tr>
+        <w:tc>
+          <w:tcPr>
+            <w:tcW w:type="dxa" w:w="2448"/>
+          </w:tcPr>
+          <w:p>
+            <w:r/>
+            <w:r>
+              <w:rPr>
+                <w:rFonts w:ascii="Calibri" w:hAnsi="Calibri" w:eastAsia="Calibri"/>
+                <w:b w:val="0"/>
+                <w:color w:val="2B2B2B"/>
+                <w:sz w:val="20"/>
+              </w:rPr>
+              <w:t>contenedores/</w:t>
+            </w:r>
+          </w:p>
+        </w:tc>
+        <w:tc>
+          <w:tcPr>
+            <w:tcW w:type="dxa" w:w="7344"/>
+          </w:tcPr>
+          <w:p>
+            <w:r/>
+            <w:r>
+              <w:rPr>
+                <w:rFonts w:ascii="Calibri" w:hAnsi="Calibri" w:eastAsia="Calibri"/>
+                <w:b w:val="0"/>
+                <w:color w:val="2B2B2B"/>
+                <w:sz w:val="20"/>
+              </w:rPr>
+              <w:t>El Dockerfile o el docker-compose.yml, y las capturas del lab (LabEx Docker Playground o Killercoda) con la fecha visible.</w:t>
+            </w:r>
+          </w:p>
+        </w:tc>
+      </w:tr>
+      <w:tr>
+        <w:tc>
+          <w:tcPr>
+            <w:tcW w:type="dxa" w:w="2448"/>
+            <w:shd w:val="clear" w:fill="F2F2F2"/>
+          </w:tcPr>
+          <w:p>
+            <w:r/>
+            <w:r>
+              <w:rPr>
+                <w:rFonts w:ascii="Calibri" w:hAnsi="Calibri" w:eastAsia="Calibri"/>
+                <w:b w:val="0"/>
+                <w:color w:val="2B2B2B"/>
+                <w:sz w:val="20"/>
+              </w:rPr>
+              <w:t>.github/workflows/</w:t>
+            </w:r>
+          </w:p>
+        </w:tc>
+        <w:tc>
+          <w:tcPr>
+            <w:tcW w:type="dxa" w:w="7344"/>
+            <w:shd w:val="clear" w:fill="F2F2F2"/>
+          </w:tcPr>
+          <w:p>
+            <w:r/>
+            <w:r>
+              <w:rPr>
+                <w:rFonts w:ascii="Calibri" w:hAnsi="Calibri" w:eastAsia="Calibri"/>
+                <w:b w:val="0"/>
+                <w:color w:val="2B2B2B"/>
+                <w:sz w:val="20"/>
+              </w:rPr>
+              <w:t>El workflow de GitHub Actions (.yml) y el stub que compila y prueba.</w:t>
+            </w:r>
+          </w:p>
+        </w:tc>
+      </w:tr>
+    </w:tbl>
+    <w:p>
+      <w:pPr>
+        <w:spacing w:after="80" w:before="0"/>
+        <w:jc w:val="left"/>
+      </w:pPr>
     </w:p>
     <w:p>
       <w:pPr>
@@ -1750,7 +1954,7 @@
           <w:color w:val="2B2B2B"/>
           <w:sz w:val="22"/>
         </w:rPr>
-        <w:t xml:space="preserve"> junto al .zip va el enlace al repositorio de GitHub o a la carpeta de Drive del proyecto.</w:t>
+        <w:t xml:space="preserve"> junto al .zip, el repositorio de GitHub donde está el workflow, o la carpeta de Drive del equipo si el workflow se entrega solo como archivo.</w:t>
       </w:r>
     </w:p>
     <w:p>
@@ -1799,6 +2003,30 @@
           <w:sz w:val="22"/>
         </w:rPr>
         <w:t xml:space="preserve"> lunes 16/11/2026, en la última clase (sesión 13; es festivo, pero sí hay clase), por Meet: 15 minutos de exposición + 5 minutos de preguntas por equipo (turno de 20 minutos); hablan todos los integrantes.</w:t>
+      </w:r>
+    </w:p>
+    <w:p>
+      <w:pPr>
+        <w:pStyle w:val="ListBullet"/>
+        <w:spacing w:after="40"/>
+      </w:pPr>
+      <w:r>
+        <w:rPr>
+          <w:rFonts w:ascii="Calibri" w:hAnsi="Calibri" w:eastAsia="Calibri"/>
+          <w:b/>
+          <w:color w:val="2B2B2B"/>
+          <w:sz w:val="22"/>
+        </w:rPr>
+        <w:t>Qué se muestra en la sustentación:</w:t>
+      </w:r>
+      <w:r>
+        <w:rPr>
+          <w:rFonts w:ascii="Calibri" w:hAnsi="Calibri" w:eastAsia="Calibri"/>
+          <w:b w:val="0"/>
+          <w:color w:val="2B2B2B"/>
+          <w:sz w:val="22"/>
+        </w:rPr>
+        <w:t xml:space="preserve"> el diagrama de despliegue, el contenedor corriendo en el lab (o sus capturas, si la sesión del lab caducó) y el workflow con sus etapas.</w:t>
       </w:r>
     </w:p>
     <w:sectPr>

</xml_diff>

<commit_message>
Proyecto Integrador: enunciados cortos centrados en el entregable y carpeta Plantilla de entrega por curso
Co-Authored-By: Claude Opus 5.5 <noreply@anthropic.com>
</commit_message>
<xml_diff>
--- a/Arquitectura de Sistemas Computacionales/Clases/Proyecto Integrador/Enunciado Proyecto Integrador - Arquitectura de Sistemas Computacionales - 2026-2.docx
+++ b/Arquitectura de Sistemas Computacionales/Clases/Proyecto Integrador/Enunciado Proyecto Integrador - Arquitectura de Sistemas Computacionales - 2026-2.docx
@@ -152,7 +152,7 @@
           <w:color w:val="095292"/>
           <w:sz w:val="24"/>
         </w:rPr>
-        <w:t>1. Propósito</w:t>
+        <w:t>1. Qué van a hacer</w:t>
       </w:r>
     </w:p>
     <w:p>
@@ -167,7 +167,41 @@
           <w:color w:val="2B2B2B"/>
           <w:sz w:val="22"/>
         </w:rPr>
-        <w:t>Diseñar y simular el despliegue de una arquitectura cloud para CloudLite App (aplicación web/API de un dominio realista a su elección: citas, academia, inventario liviano, etc.). Integra diagramas, contenedores en lab de navegador y CI/CD conceptual con GitHub Actions — sin cloud de pago ni tarjeta.</w:t>
+        <w:t xml:space="preserve">Diseñar y simular el despliegue en la nube de </w:t>
+      </w:r>
+      <w:r>
+        <w:rPr>
+          <w:rFonts w:ascii="Calibri" w:hAnsi="Calibri" w:eastAsia="Calibri"/>
+          <w:b/>
+          <w:color w:val="2B2B2B"/>
+          <w:sz w:val="22"/>
+        </w:rPr>
+        <w:t>CloudLite App</w:t>
+      </w:r>
+      <w:r>
+        <w:rPr>
+          <w:rFonts w:ascii="Calibri" w:hAnsi="Calibri" w:eastAsia="Calibri"/>
+          <w:b w:val="0"/>
+          <w:color w:val="2B2B2B"/>
+          <w:sz w:val="22"/>
+        </w:rPr>
+        <w:t>, una aplicación web de un dominio que elige el equipo (citas, inventario, una academia…): sus diagramas, un servicio en contenedor y un flujo de CI/CD.</w:t>
+      </w:r>
+    </w:p>
+    <w:p>
+      <w:pPr>
+        <w:spacing w:after="120" w:before="0"/>
+        <w:jc w:val="left"/>
+        <w:shd w:val="clear" w:fill="E8F4FA"/>
+      </w:pPr>
+      <w:r>
+        <w:rPr>
+          <w:rFonts w:ascii="Calibri" w:hAnsi="Calibri" w:eastAsia="Calibri"/>
+          <w:b w:val="0"/>
+          <w:color w:val="2B2B2B"/>
+          <w:sz w:val="22"/>
+        </w:rPr>
+        <w:t>Sin nube de pago ni tarjeta: todo se hace en laboratorios gratuitos del navegador.</w:t>
       </w:r>
     </w:p>
     <w:p>
@@ -182,32 +216,7 @@
           <w:color w:val="2B2B2B"/>
           <w:sz w:val="22"/>
         </w:rPr>
-        <w:t>Peso: 20% del Corte 3 (Acuerdo pedagógico). El Parcial 3 (15%) y la asistencia (5%) se evalúan por separado.</w:t>
-      </w:r>
-    </w:p>
-    <w:p>
-      <w:pPr>
-        <w:spacing w:after="160" w:before="0"/>
-        <w:jc w:val="left"/>
-        <w:shd w:val="clear" w:fill="FFF8D6"/>
-      </w:pPr>
-      <w:r>
-        <w:rPr>
-          <w:rFonts w:ascii="Calibri" w:hAnsi="Calibri" w:eastAsia="Calibri"/>
-          <w:b/>
-          <w:color w:val="2B2B2B"/>
-          <w:sz w:val="22"/>
-        </w:rPr>
-        <w:t>Modalidad del proyecto: en equipo de 4 a 5 integrantes (máximo 5).</w:t>
-      </w:r>
-      <w:r>
-        <w:rPr>
-          <w:rFonts w:ascii="Calibri" w:hAnsi="Calibri" w:eastAsia="Calibri"/>
-          <w:b w:val="0"/>
-          <w:color w:val="2B2B2B"/>
-          <w:sz w:val="22"/>
-        </w:rPr>
-        <w:t xml:space="preserve"> Este semestre el Proyecto Integrador no es individual: lo construye el equipo completo y lo sustentan todos sus integrantes. Esta regla es solo para el proyecto: talleres, quices, parciales y demás entregables mantienen la modalidad que se indique en cada uno.</w:t>
+        <w:t>Vale el 20% del Corte 3.</w:t>
       </w:r>
     </w:p>
     <w:p>
@@ -222,13 +231,14 @@
           <w:color w:val="095292"/>
           <w:sz w:val="24"/>
         </w:rPr>
-        <w:t>2. Alcance de CloudLite App</w:t>
+        <w:t>2. Qué se entrega</w:t>
       </w:r>
     </w:p>
     <w:p>
       <w:pPr>
-        <w:pStyle w:val="ListBullet"/>
-        <w:spacing w:after="40"/>
+        <w:spacing w:after="120" w:before="0"/>
+        <w:jc w:val="left"/>
+        <w:shd w:val="clear" w:fill="E8F4FA"/>
       </w:pPr>
       <w:r>
         <w:rPr>
@@ -237,14 +247,17 @@
           <w:color w:val="2B2B2B"/>
           <w:sz w:val="22"/>
         </w:rPr>
-        <w:t>Elegir un dominio concreto y justificar 3–5 capacidades funcionales.</w:t>
+        <w:t xml:space="preserve">Un solo archivo .zip con esta forma. La carpeta </w:t>
       </w:r>
-    </w:p>
-    <w:p>
-      <w:pPr>
-        <w:pStyle w:val="ListBullet"/>
-        <w:spacing w:after="40"/>
-      </w:pPr>
+      <w:r>
+        <w:rPr>
+          <w:rFonts w:ascii="Calibri" w:hAnsi="Calibri" w:eastAsia="Calibri"/>
+          <w:b/>
+          <w:color w:val="2B2B2B"/>
+          <w:sz w:val="22"/>
+        </w:rPr>
+        <w:t>«Plantilla de entrega»</w:t>
+      </w:r>
       <w:r>
         <w:rPr>
           <w:rFonts w:ascii="Calibri" w:hAnsi="Calibri" w:eastAsia="Calibri"/>
@@ -252,190 +265,225 @@
           <w:color w:val="2B2B2B"/>
           <w:sz w:val="22"/>
         </w:rPr>
-        <w:t>Decidir modelo de servicio dominante (IaaS / PaaS / SaaS) y por qué.</w:t>
+        <w:t>, en esta misma carpeta, ya la trae armada: descárguenla, llénenla siguiendo sus INSTRUCCIONES y comprímanla.</w:t>
       </w:r>
     </w:p>
     <w:p>
       <w:pPr>
-        <w:pStyle w:val="ListBullet"/>
-        <w:spacing w:after="40"/>
+        <w:spacing w:after="0" w:before="0"/>
+        <w:shd w:val="clear" w:fill="F4F6F8"/>
       </w:pPr>
       <w:r>
         <w:rPr>
-          <w:rFonts w:ascii="Calibri" w:hAnsi="Calibri" w:eastAsia="Calibri"/>
+          <w:rFonts w:ascii="Consolas" w:hAnsi="Consolas" w:eastAsia="Consolas"/>
           <w:b w:val="0"/>
           <w:color w:val="2B2B2B"/>
-          <w:sz w:val="22"/>
+          <w:sz w:val="19"/>
         </w:rPr>
-        <w:t>Arquitectura lógica + de despliegue (capas, componentes, red, almacenamiento).</w:t>
+        <w:t xml:space="preserve">Equipo &lt;nombre&gt;.zip                 </w:t>
       </w:r>
     </w:p>
     <w:p>
       <w:pPr>
-        <w:pStyle w:val="ListBullet"/>
-        <w:spacing w:after="40"/>
+        <w:spacing w:after="0" w:before="0"/>
+        <w:shd w:val="clear" w:fill="F4F6F8"/>
       </w:pPr>
       <w:r>
         <w:rPr>
-          <w:rFonts w:ascii="Calibri" w:hAnsi="Calibri" w:eastAsia="Calibri"/>
+          <w:rFonts w:ascii="Consolas" w:hAnsi="Consolas" w:eastAsia="Consolas"/>
           <w:b w:val="0"/>
           <w:color w:val="2B2B2B"/>
-          <w:sz w:val="22"/>
+          <w:sz w:val="19"/>
         </w:rPr>
-        <w:t>Contenedorización de al menos un servicio (demo en LabEx Docker Playground o Killercoda).</w:t>
+        <w:t>├── Documento de arquitectura.docx  ← con las secciones de la plantilla</w:t>
       </w:r>
     </w:p>
     <w:p>
       <w:pPr>
-        <w:pStyle w:val="ListBullet"/>
-        <w:spacing w:after="40"/>
+        <w:spacing w:after="0" w:before="0"/>
+        <w:shd w:val="clear" w:fill="F4F6F8"/>
       </w:pPr>
       <w:r>
         <w:rPr>
-          <w:rFonts w:ascii="Calibri" w:hAnsi="Calibri" w:eastAsia="Calibri"/>
+          <w:rFonts w:ascii="Consolas" w:hAnsi="Consolas" w:eastAsia="Consolas"/>
           <w:b w:val="0"/>
           <w:color w:val="2B2B2B"/>
-          <w:sz w:val="22"/>
+          <w:sz w:val="19"/>
         </w:rPr>
-        <w:t>Pipeline CI/CD conceptual (GitHub Actions): build + test + artefactos (sin runner de pago).</w:t>
+        <w:t>├── diagramas/                      ← cada uno en PNG + su fuente (.drawio o .mmd)</w:t>
       </w:r>
     </w:p>
     <w:p>
       <w:pPr>
-        <w:pStyle w:val="ListBullet"/>
-        <w:spacing w:after="40"/>
+        <w:spacing w:after="0" w:before="0"/>
+        <w:shd w:val="clear" w:fill="F4F6F8"/>
       </w:pPr>
       <w:r>
         <w:rPr>
-          <w:rFonts w:ascii="Calibri" w:hAnsi="Calibri" w:eastAsia="Calibri"/>
+          <w:rFonts w:ascii="Consolas" w:hAnsi="Consolas" w:eastAsia="Consolas"/>
           <w:b w:val="0"/>
           <w:color w:val="2B2B2B"/>
-          <w:sz w:val="22"/>
+          <w:sz w:val="19"/>
         </w:rPr>
-        <w:t>Seguridad, monitoreo, costos/sostenibilidad y escalabilidad (al menos un escenario).</w:t>
+        <w:t xml:space="preserve">│   ├── 1 componentes.png           </w:t>
       </w:r>
     </w:p>
     <w:p>
       <w:pPr>
-        <w:spacing w:after="120" w:before="240"/>
-        <w:jc w:val="left"/>
+        <w:spacing w:after="0" w:before="0"/>
+        <w:shd w:val="clear" w:fill="F4F6F8"/>
       </w:pPr>
       <w:r>
         <w:rPr>
-          <w:rFonts w:ascii="Calibri" w:hAnsi="Calibri" w:eastAsia="Calibri"/>
-          <w:b/>
-          <w:color w:val="095292"/>
-          <w:sz w:val="24"/>
+          <w:rFonts w:ascii="Consolas" w:hAnsi="Consolas" w:eastAsia="Consolas"/>
+          <w:b w:val="0"/>
+          <w:color w:val="2B2B2B"/>
+          <w:sz w:val="19"/>
         </w:rPr>
-        <w:t>3. Entregables obligatorios</w:t>
+        <w:t xml:space="preserve">│   ├── 2 despliegue.png            </w:t>
       </w:r>
     </w:p>
     <w:p>
       <w:pPr>
-        <w:pStyle w:val="ListBullet"/>
-        <w:spacing w:after="40"/>
+        <w:spacing w:after="0" w:before="0"/>
+        <w:shd w:val="clear" w:fill="F4F6F8"/>
       </w:pPr>
       <w:r>
         <w:rPr>
-          <w:rFonts w:ascii="Calibri" w:hAnsi="Calibri" w:eastAsia="Calibri"/>
+          <w:rFonts w:ascii="Consolas" w:hAnsi="Consolas" w:eastAsia="Consolas"/>
           <w:b w:val="0"/>
           <w:color w:val="2B2B2B"/>
-          <w:sz w:val="22"/>
+          <w:sz w:val="19"/>
         </w:rPr>
-        <w:t>Documento de arquitectura (PDF/DOCX): contexto, ADRs breves, riesgos, costos estimados en lenguaje cualitativo (bajo/medio — sin factura real).</w:t>
+        <w:t xml:space="preserve">│   └── 3 ci-cd.png                 </w:t>
       </w:r>
     </w:p>
     <w:p>
       <w:pPr>
-        <w:pStyle w:val="ListBullet"/>
-        <w:spacing w:after="40"/>
+        <w:spacing w:after="0" w:before="0"/>
+        <w:shd w:val="clear" w:fill="F4F6F8"/>
       </w:pPr>
       <w:r>
         <w:rPr>
-          <w:rFonts w:ascii="Calibri" w:hAnsi="Calibri" w:eastAsia="Calibri"/>
+          <w:rFonts w:ascii="Consolas" w:hAnsi="Consolas" w:eastAsia="Consolas"/>
           <w:b w:val="0"/>
           <w:color w:val="2B2B2B"/>
-          <w:sz w:val="22"/>
+          <w:sz w:val="19"/>
         </w:rPr>
-        <w:t>Diagramas (draw.io / diagrams.net): al menos (a) componentes/C4-lite, (b) despliegue, (c) flujo CI/CD.</w:t>
+        <w:t>├── app/                            ← el servicio mínimo (stub)</w:t>
       </w:r>
     </w:p>
     <w:p>
       <w:pPr>
-        <w:pStyle w:val="ListBullet"/>
-        <w:spacing w:after="40"/>
+        <w:spacing w:after="0" w:before="0"/>
+        <w:shd w:val="clear" w:fill="F4F6F8"/>
       </w:pPr>
       <w:r>
         <w:rPr>
-          <w:rFonts w:ascii="Calibri" w:hAnsi="Calibri" w:eastAsia="Calibri"/>
+          <w:rFonts w:ascii="Consolas" w:hAnsi="Consolas" w:eastAsia="Consolas"/>
           <w:b w:val="0"/>
           <w:color w:val="2B2B2B"/>
-          <w:sz w:val="22"/>
+          <w:sz w:val="19"/>
         </w:rPr>
-        <w:t>Lab de contenedores: Dockerfile o compose mínimo + captura/enlace de sesión LabEx Docker Playground o Killercoda.</w:t>
+        <w:t xml:space="preserve">├── contenedores/                   </w:t>
       </w:r>
     </w:p>
     <w:p>
       <w:pPr>
-        <w:pStyle w:val="ListBullet"/>
-        <w:spacing w:after="40"/>
+        <w:spacing w:after="0" w:before="0"/>
+        <w:shd w:val="clear" w:fill="F4F6F8"/>
       </w:pPr>
       <w:r>
         <w:rPr>
-          <w:rFonts w:ascii="Calibri" w:hAnsi="Calibri" w:eastAsia="Calibri"/>
+          <w:rFonts w:ascii="Consolas" w:hAnsi="Consolas" w:eastAsia="Consolas"/>
           <w:b w:val="0"/>
           <w:color w:val="2B2B2B"/>
-          <w:sz w:val="22"/>
+          <w:sz w:val="19"/>
         </w:rPr>
-        <w:t>Repo o carpeta con workflow GitHub Actions (.yml) que compile/pruebe un stub (aunque el «deploy» sea simulado).</w:t>
+        <w:t>│   ├── Dockerfile                  ← o docker-compose.yml</w:t>
       </w:r>
     </w:p>
     <w:p>
       <w:pPr>
-        <w:pStyle w:val="ListBullet"/>
-        <w:spacing w:after="40"/>
+        <w:spacing w:after="0" w:before="0"/>
+        <w:shd w:val="clear" w:fill="F4F6F8"/>
       </w:pPr>
       <w:r>
         <w:rPr>
-          <w:rFonts w:ascii="Calibri" w:hAnsi="Calibri" w:eastAsia="Calibri"/>
+          <w:rFonts w:ascii="Consolas" w:hAnsi="Consolas" w:eastAsia="Consolas"/>
           <w:b w:val="0"/>
           <w:color w:val="2B2B2B"/>
-          <w:sz w:val="22"/>
+          <w:sz w:val="19"/>
         </w:rPr>
-        <w:t>Sustentación en vivo en la última clase: 15 minutos de exposición + 5 minutos de preguntas por equipo (turno de 20 minutos); hablan todos los integrantes, con demo de diagrama + lab.</w:t>
+        <w:t>│   └── capturas/                   ← el lab corriendo, con la fecha visible</w:t>
       </w:r>
     </w:p>
     <w:p>
       <w:pPr>
-        <w:spacing w:after="120" w:before="240"/>
-        <w:jc w:val="left"/>
+        <w:spacing w:after="0" w:before="0"/>
+        <w:shd w:val="clear" w:fill="F4F6F8"/>
       </w:pPr>
       <w:r>
         <w:rPr>
-          <w:rFonts w:ascii="Calibri" w:hAnsi="Calibri" w:eastAsia="Calibri"/>
-          <w:b/>
-          <w:color w:val="095292"/>
-          <w:sz w:val="24"/>
+          <w:rFonts w:ascii="Consolas" w:hAnsi="Consolas" w:eastAsia="Consolas"/>
+          <w:b w:val="0"/>
+          <w:color w:val="2B2B2B"/>
+          <w:sz w:val="19"/>
         </w:rPr>
-        <w:t>4. Hitos y fechas de referencia (Plan 2026-2)</w:t>
+        <w:t xml:space="preserve">└── .github/                        </w:t>
       </w:r>
+    </w:p>
+    <w:p>
+      <w:pPr>
+        <w:spacing w:after="0" w:before="0"/>
+        <w:shd w:val="clear" w:fill="F4F6F8"/>
+      </w:pPr>
+      <w:r>
+        <w:rPr>
+          <w:rFonts w:ascii="Consolas" w:hAnsi="Consolas" w:eastAsia="Consolas"/>
+          <w:b w:val="0"/>
+          <w:color w:val="2B2B2B"/>
+          <w:sz w:val="19"/>
+        </w:rPr>
+        <w:t xml:space="preserve">    └── workflows/                  </w:t>
+      </w:r>
+    </w:p>
+    <w:p>
+      <w:pPr>
+        <w:spacing w:after="0" w:before="0"/>
+        <w:shd w:val="clear" w:fill="F4F6F8"/>
+      </w:pPr>
+      <w:r>
+        <w:rPr>
+          <w:rFonts w:ascii="Consolas" w:hAnsi="Consolas" w:eastAsia="Consolas"/>
+          <w:b w:val="0"/>
+          <w:color w:val="2B2B2B"/>
+          <w:sz w:val="19"/>
+        </w:rPr>
+        <w:t xml:space="preserve">        └── ci.yml                  ← construye y prueba app/</w:t>
+      </w:r>
+    </w:p>
+    <w:p>
+      <w:pPr>
+        <w:spacing w:after="80" w:before="0"/>
+        <w:jc w:val="left"/>
+      </w:pPr>
     </w:p>
     <w:tbl>
       <w:tblPr>
         <w:tblStyle w:val="TableGrid"/>
         <w:tblW w:type="auto" w:w="0"/>
+        <w:tblLayout w:type="fixed"/>
         <w:tblLook w:firstColumn="1" w:firstRow="1" w:lastColumn="0" w:lastRow="0" w:noHBand="0" w:noVBand="1" w:val="04A0"/>
       </w:tblPr>
       <w:tblGrid>
-        <w:gridCol w:w="2448"/>
-        <w:gridCol w:w="2448"/>
-        <w:gridCol w:w="2448"/>
-        <w:gridCol w:w="2448"/>
+        <w:gridCol w:w="4896"/>
+        <w:gridCol w:w="4896"/>
       </w:tblGrid>
       <w:tr>
         <w:tc>
           <w:tcPr>
-            <w:tcW w:type="dxa" w:w="2448"/>
+            <w:tcW w:type="dxa" w:w="2736"/>
             <w:shd w:val="clear" w:fill="095292"/>
           </w:tcPr>
           <w:p>
@@ -447,13 +495,13 @@
                 <w:color w:val="FFFFFF"/>
                 <w:sz w:val="20"/>
               </w:rPr>
-              <w:t>Hito</w:t>
+              <w:t>Pieza</w:t>
             </w:r>
           </w:p>
         </w:tc>
         <w:tc>
           <w:tcPr>
-            <w:tcW w:type="dxa" w:w="2448"/>
+            <w:tcW w:type="dxa" w:w="7056"/>
             <w:shd w:val="clear" w:fill="095292"/>
           </w:tcPr>
           <w:p>
@@ -465,43 +513,7 @@
                 <w:color w:val="FFFFFF"/>
                 <w:sz w:val="20"/>
               </w:rPr>
-              <w:t>Sesión</w:t>
-            </w:r>
-          </w:p>
-        </w:tc>
-        <w:tc>
-          <w:tcPr>
-            <w:tcW w:type="dxa" w:w="2448"/>
-            <w:shd w:val="clear" w:fill="095292"/>
-          </w:tcPr>
-          <w:p>
-            <w:r/>
-            <w:r>
-              <w:rPr>
-                <w:rFonts w:ascii="Calibri" w:hAnsi="Calibri" w:eastAsia="Calibri"/>
-                <w:b/>
-                <w:color w:val="FFFFFF"/>
-                <w:sz w:val="20"/>
-              </w:rPr>
-              <w:t>Fecha</w:t>
-            </w:r>
-          </w:p>
-        </w:tc>
-        <w:tc>
-          <w:tcPr>
-            <w:tcW w:type="dxa" w:w="2448"/>
-            <w:shd w:val="clear" w:fill="095292"/>
-          </w:tcPr>
-          <w:p>
-            <w:r/>
-            <w:r>
-              <w:rPr>
-                <w:rFonts w:ascii="Calibri" w:hAnsi="Calibri" w:eastAsia="Calibri"/>
-                <w:b/>
-                <w:color w:val="FFFFFF"/>
-                <w:sz w:val="20"/>
-              </w:rPr>
-              <w:t>Qué entregar / hacer</w:t>
+              <w:t>Qué tiene que tener</w:t>
             </w:r>
           </w:p>
         </w:tc>
@@ -509,7 +521,7 @@
       <w:tr>
         <w:tc>
           <w:tcPr>
-            <w:tcW w:type="dxa" w:w="2448"/>
+            <w:tcW w:type="dxa" w:w="2736"/>
           </w:tcPr>
           <w:p>
             <w:r/>
@@ -520,13 +532,13 @@
                 <w:color w:val="2B2B2B"/>
                 <w:sz w:val="20"/>
               </w:rPr>
-              <w:t>Fundamentos</w:t>
+              <w:t>Documento de arquitectura.docx</w:t>
             </w:r>
           </w:p>
         </w:tc>
         <w:tc>
           <w:tcPr>
-            <w:tcW w:type="dxa" w:w="2448"/>
+            <w:tcW w:type="dxa" w:w="7056"/>
           </w:tcPr>
           <w:p>
             <w:r/>
@@ -537,41 +549,7 @@
                 <w:color w:val="2B2B2B"/>
                 <w:sz w:val="20"/>
               </w:rPr>
-              <w:t>Sesiones 1–5</w:t>
-            </w:r>
-          </w:p>
-        </w:tc>
-        <w:tc>
-          <w:tcPr>
-            <w:tcW w:type="dxa" w:w="2448"/>
-          </w:tcPr>
-          <w:p>
-            <w:r/>
-            <w:r>
-              <w:rPr>
-                <w:rFonts w:ascii="Calibri" w:hAnsi="Calibri" w:eastAsia="Calibri"/>
-                <w:b w:val="0"/>
-                <w:color w:val="2B2B2B"/>
-                <w:sz w:val="20"/>
-              </w:rPr>
-              <w:t>ago–sep</w:t>
-            </w:r>
-          </w:p>
-        </w:tc>
-        <w:tc>
-          <w:tcPr>
-            <w:tcW w:type="dxa" w:w="2448"/>
-          </w:tcPr>
-          <w:p>
-            <w:r/>
-            <w:r>
-              <w:rPr>
-                <w:rFonts w:ascii="Calibri" w:hAnsi="Calibri" w:eastAsia="Calibri"/>
-                <w:b w:val="0"/>
-                <w:color w:val="2B2B2B"/>
-                <w:sz w:val="20"/>
-              </w:rPr>
-              <w:t>Dominio, IaaS/PaaS/SaaS, boceto C4</w:t>
+              <w:t>Las secciones de la plantilla: dominio y alcance (3 a 5 capacidades), modelo de servicio (IaaS, PaaS o SaaS, y por qué), decisiones, despliegue y contenedores, CI/CD, seguridad · monitoreo · costos · escalabilidad, y riesgos.</w:t>
             </w:r>
           </w:p>
         </w:tc>
@@ -579,7 +557,7 @@
       <w:tr>
         <w:tc>
           <w:tcPr>
-            <w:tcW w:type="dxa" w:w="2448"/>
+            <w:tcW w:type="dxa" w:w="2736"/>
             <w:shd w:val="clear" w:fill="F2F2F2"/>
           </w:tcPr>
           <w:p>
@@ -591,13 +569,13 @@
                 <w:color w:val="2B2B2B"/>
                 <w:sz w:val="20"/>
               </w:rPr>
-              <w:t>Profundización</w:t>
+              <w:t>diagramas/</w:t>
             </w:r>
           </w:p>
         </w:tc>
         <w:tc>
           <w:tcPr>
-            <w:tcW w:type="dxa" w:w="2448"/>
+            <w:tcW w:type="dxa" w:w="7056"/>
             <w:shd w:val="clear" w:fill="F2F2F2"/>
           </w:tcPr>
           <w:p>
@@ -609,13 +587,51 @@
                 <w:color w:val="2B2B2B"/>
                 <w:sz w:val="20"/>
               </w:rPr>
-              <w:t>Sesiones 6–9</w:t>
+              <w:t>Los tres —componentes (C4), despliegue y flujo de CI/CD—, legibles y con los mismos nombres en los tres.</w:t>
+            </w:r>
+          </w:p>
+        </w:tc>
+      </w:tr>
+      <w:tr>
+        <w:tc>
+          <w:tcPr>
+            <w:tcW w:type="dxa" w:w="2736"/>
+          </w:tcPr>
+          <w:p>
+            <w:r/>
+            <w:r>
+              <w:rPr>
+                <w:rFonts w:ascii="Calibri" w:hAnsi="Calibri" w:eastAsia="Calibri"/>
+                <w:b w:val="0"/>
+                <w:color w:val="2B2B2B"/>
+                <w:sz w:val="20"/>
+              </w:rPr>
+              <w:t>app/</w:t>
             </w:r>
           </w:p>
         </w:tc>
         <w:tc>
           <w:tcPr>
-            <w:tcW w:type="dxa" w:w="2448"/>
+            <w:tcW w:type="dxa" w:w="7056"/>
+          </w:tcPr>
+          <w:p>
+            <w:r/>
+            <w:r>
+              <w:rPr>
+                <w:rFonts w:ascii="Calibri" w:hAnsi="Calibri" w:eastAsia="Calibri"/>
+                <w:b w:val="0"/>
+                <w:color w:val="2B2B2B"/>
+                <w:sz w:val="20"/>
+              </w:rPr>
+              <w:t>El servicio mínimo que se contiene y que el workflow construye y prueba.</w:t>
+            </w:r>
+          </w:p>
+        </w:tc>
+      </w:tr>
+      <w:tr>
+        <w:tc>
+          <w:tcPr>
+            <w:tcW w:type="dxa" w:w="2736"/>
             <w:shd w:val="clear" w:fill="F2F2F2"/>
           </w:tcPr>
           <w:p>
@@ -627,13 +643,13 @@
                 <w:color w:val="2B2B2B"/>
                 <w:sz w:val="20"/>
               </w:rPr>
-              <w:t>sep–oct</w:t>
+              <w:t>contenedores/</w:t>
             </w:r>
           </w:p>
         </w:tc>
         <w:tc>
           <w:tcPr>
-            <w:tcW w:type="dxa" w:w="2448"/>
+            <w:tcW w:type="dxa" w:w="7056"/>
             <w:shd w:val="clear" w:fill="F2F2F2"/>
           </w:tcPr>
           <w:p>
@@ -645,7 +661,7 @@
                 <w:color w:val="2B2B2B"/>
                 <w:sz w:val="20"/>
               </w:rPr>
-              <w:t>Seguridad, redes, monitoreo, CI/CD</w:t>
+              <w:t>El Dockerfile (o el docker-compose.yml) y las capturas del lab (LabEx o Killercoda) donde se ve corriendo, con la fecha visible.</w:t>
             </w:r>
           </w:p>
         </w:tc>
@@ -653,7 +669,7 @@
       <w:tr>
         <w:tc>
           <w:tcPr>
-            <w:tcW w:type="dxa" w:w="2448"/>
+            <w:tcW w:type="dxa" w:w="2736"/>
           </w:tcPr>
           <w:p>
             <w:r/>
@@ -664,13 +680,13 @@
                 <w:color w:val="2B2B2B"/>
                 <w:sz w:val="20"/>
               </w:rPr>
-              <w:t>Avance PI + rendimiento</w:t>
+              <w:t>.github/workflows/ci.yml</w:t>
             </w:r>
           </w:p>
         </w:tc>
         <w:tc>
           <w:tcPr>
-            <w:tcW w:type="dxa" w:w="2448"/>
+            <w:tcW w:type="dxa" w:w="7056"/>
           </w:tcPr>
           <w:p>
             <w:r/>
@@ -681,851 +697,7 @@
                 <w:color w:val="2B2B2B"/>
                 <w:sz w:val="20"/>
               </w:rPr>
-              <w:t>Sesión 10 (doble · Clases 11+12)</w:t>
-            </w:r>
-          </w:p>
-        </w:tc>
-        <w:tc>
-          <w:tcPr>
-            <w:tcW w:type="dxa" w:w="2448"/>
-          </w:tcPr>
-          <w:p>
-            <w:r/>
-            <w:r>
-              <w:rPr>
-                <w:rFonts w:ascii="Calibri" w:hAnsi="Calibri" w:eastAsia="Calibri"/>
-                <w:b w:val="0"/>
-                <w:color w:val="2B2B2B"/>
-                <w:sz w:val="20"/>
-              </w:rPr>
-              <w:t>26/10/2026</w:t>
-            </w:r>
-          </w:p>
-        </w:tc>
-        <w:tc>
-          <w:tcPr>
-            <w:tcW w:type="dxa" w:w="2448"/>
-          </w:tcPr>
-          <w:p>
-            <w:r/>
-            <w:r>
-              <w:rPr>
-                <w:rFonts w:ascii="Calibri" w:hAnsi="Calibri" w:eastAsia="Calibri"/>
-                <w:b w:val="0"/>
-                <w:color w:val="2B2B2B"/>
-                <w:sz w:val="20"/>
-              </w:rPr>
-              <w:t>Diagramas v1 + checklist · escenario de prueba y métricas objetivo (cierre: domingo 01/11, 11:59 p. m.)</w:t>
-            </w:r>
-          </w:p>
-        </w:tc>
-      </w:tr>
-      <w:tr>
-        <w:tc>
-          <w:tcPr>
-            <w:tcW w:type="dxa" w:w="2448"/>
-            <w:shd w:val="clear" w:fill="F2F2F2"/>
-          </w:tcPr>
-          <w:p>
-            <w:r/>
-            <w:r>
-              <w:rPr>
-                <w:rFonts w:ascii="Calibri" w:hAnsi="Calibri" w:eastAsia="Calibri"/>
-                <w:b w:val="0"/>
-                <w:color w:val="2B2B2B"/>
-                <w:sz w:val="20"/>
-              </w:rPr>
-              <w:t>Escalabilidad</w:t>
-            </w:r>
-          </w:p>
-        </w:tc>
-        <w:tc>
-          <w:tcPr>
-            <w:tcW w:type="dxa" w:w="2448"/>
-            <w:shd w:val="clear" w:fill="F2F2F2"/>
-          </w:tcPr>
-          <w:p>
-            <w:r/>
-            <w:r>
-              <w:rPr>
-                <w:rFonts w:ascii="Calibri" w:hAnsi="Calibri" w:eastAsia="Calibri"/>
-                <w:b w:val="0"/>
-                <w:color w:val="2B2B2B"/>
-                <w:sz w:val="20"/>
-              </w:rPr>
-              <w:t>Sesión 11 (autónoma · Clase 13)</w:t>
-            </w:r>
-          </w:p>
-        </w:tc>
-        <w:tc>
-          <w:tcPr>
-            <w:tcW w:type="dxa" w:w="2448"/>
-            <w:shd w:val="clear" w:fill="F2F2F2"/>
-          </w:tcPr>
-          <w:p>
-            <w:r/>
-            <w:r>
-              <w:rPr>
-                <w:rFonts w:ascii="Calibri" w:hAnsi="Calibri" w:eastAsia="Calibri"/>
-                <w:b w:val="0"/>
-                <w:color w:val="2B2B2B"/>
-                <w:sz w:val="20"/>
-              </w:rPr>
-              <w:t>02/11/2026</w:t>
-            </w:r>
-          </w:p>
-        </w:tc>
-        <w:tc>
-          <w:tcPr>
-            <w:tcW w:type="dxa" w:w="2448"/>
-            <w:shd w:val="clear" w:fill="F2F2F2"/>
-          </w:tcPr>
-          <w:p>
-            <w:r/>
-            <w:r>
-              <w:rPr>
-                <w:rFonts w:ascii="Calibri" w:hAnsi="Calibri" w:eastAsia="Calibri"/>
-                <w:b w:val="0"/>
-                <w:color w:val="2B2B2B"/>
-                <w:sz w:val="20"/>
-              </w:rPr>
-              <w:t>Sección de autoescalado del informe (cierre: domingo 08/11, 11:59 p. m.)</w:t>
-            </w:r>
-          </w:p>
-        </w:tc>
-      </w:tr>
-      <w:tr>
-        <w:tc>
-          <w:tcPr>
-            <w:tcW w:type="dxa" w:w="2448"/>
-          </w:tcPr>
-          <w:p>
-            <w:r/>
-            <w:r>
-              <w:rPr>
-                <w:rFonts w:ascii="Calibri" w:hAnsi="Calibri" w:eastAsia="Calibri"/>
-                <w:b w:val="0"/>
-                <w:color w:val="2B2B2B"/>
-                <w:sz w:val="20"/>
-              </w:rPr>
-              <w:t>Parcial 3</w:t>
-            </w:r>
-          </w:p>
-        </w:tc>
-        <w:tc>
-          <w:tcPr>
-            <w:tcW w:type="dxa" w:w="2448"/>
-          </w:tcPr>
-          <w:p>
-            <w:r/>
-            <w:r>
-              <w:rPr>
-                <w:rFonts w:ascii="Calibri" w:hAnsi="Calibri" w:eastAsia="Calibri"/>
-                <w:b w:val="0"/>
-                <w:color w:val="2B2B2B"/>
-                <w:sz w:val="20"/>
-              </w:rPr>
-              <w:t>Sesión 12 (Clase 14)</w:t>
-            </w:r>
-          </w:p>
-        </w:tc>
-        <w:tc>
-          <w:tcPr>
-            <w:tcW w:type="dxa" w:w="2448"/>
-          </w:tcPr>
-          <w:p>
-            <w:r/>
-            <w:r>
-              <w:rPr>
-                <w:rFonts w:ascii="Calibri" w:hAnsi="Calibri" w:eastAsia="Calibri"/>
-                <w:b w:val="0"/>
-                <w:color w:val="2B2B2B"/>
-                <w:sz w:val="20"/>
-              </w:rPr>
-              <w:t>09/11/2026</w:t>
-            </w:r>
-          </w:p>
-        </w:tc>
-        <w:tc>
-          <w:tcPr>
-            <w:tcW w:type="dxa" w:w="2448"/>
-          </w:tcPr>
-          <w:p>
-            <w:r/>
-            <w:r>
-              <w:rPr>
-                <w:rFonts w:ascii="Calibri" w:hAnsi="Calibri" w:eastAsia="Calibri"/>
-                <w:b w:val="0"/>
-                <w:color w:val="2B2B2B"/>
-                <w:sz w:val="20"/>
-              </w:rPr>
-              <w:t>Día de parcial = solo evaluación (virtual síncrona por Meet); el ensayo y la preparación fueron en la Sesión 10 (Clase 12)</w:t>
-            </w:r>
-          </w:p>
-        </w:tc>
-      </w:tr>
-      <w:tr>
-        <w:tc>
-          <w:tcPr>
-            <w:tcW w:type="dxa" w:w="2448"/>
-            <w:shd w:val="clear" w:fill="F2F2F2"/>
-          </w:tcPr>
-          <w:p>
-            <w:r/>
-            <w:r>
-              <w:rPr>
-                <w:rFonts w:ascii="Calibri" w:hAnsi="Calibri" w:eastAsia="Calibri"/>
-                <w:b w:val="0"/>
-                <w:color w:val="2B2B2B"/>
-                <w:sz w:val="20"/>
-              </w:rPr>
-              <w:t>Entrega final del PI</w:t>
-            </w:r>
-          </w:p>
-        </w:tc>
-        <w:tc>
-          <w:tcPr>
-            <w:tcW w:type="dxa" w:w="2448"/>
-            <w:shd w:val="clear" w:fill="F2F2F2"/>
-          </w:tcPr>
-          <w:p>
-            <w:r/>
-            <w:r>
-              <w:rPr>
-                <w:rFonts w:ascii="Calibri" w:hAnsi="Calibri" w:eastAsia="Calibri"/>
-                <w:b w:val="0"/>
-                <w:color w:val="2B2B2B"/>
-                <w:sz w:val="20"/>
-              </w:rPr>
-              <w:t>—</w:t>
-            </w:r>
-          </w:p>
-        </w:tc>
-        <w:tc>
-          <w:tcPr>
-            <w:tcW w:type="dxa" w:w="2448"/>
-            <w:shd w:val="clear" w:fill="F2F2F2"/>
-          </w:tcPr>
-          <w:p>
-            <w:r/>
-            <w:r>
-              <w:rPr>
-                <w:rFonts w:ascii="Calibri" w:hAnsi="Calibri" w:eastAsia="Calibri"/>
-                <w:b w:val="0"/>
-                <w:color w:val="2B2B2B"/>
-                <w:sz w:val="20"/>
-              </w:rPr>
-              <w:t>15/11/2026</w:t>
-            </w:r>
-          </w:p>
-        </w:tc>
-        <w:tc>
-          <w:tcPr>
-            <w:tcW w:type="dxa" w:w="2448"/>
-            <w:shd w:val="clear" w:fill="F2F2F2"/>
-          </w:tcPr>
-          <w:p>
-            <w:r/>
-            <w:r>
-              <w:rPr>
-                <w:rFonts w:ascii="Calibri" w:hAnsi="Calibri" w:eastAsia="Calibri"/>
-                <w:b w:val="0"/>
-                <w:color w:val="2B2B2B"/>
-                <w:sz w:val="20"/>
-              </w:rPr>
-              <w:t>Plazo único: domingo, 11:59 p. m. Un .zip + el enlace al repositorio o a la carpeta de Drive</w:t>
-            </w:r>
-          </w:p>
-        </w:tc>
-      </w:tr>
-      <w:tr>
-        <w:tc>
-          <w:tcPr>
-            <w:tcW w:type="dxa" w:w="2448"/>
-          </w:tcPr>
-          <w:p>
-            <w:r/>
-            <w:r>
-              <w:rPr>
-                <w:rFonts w:ascii="Calibri" w:hAnsi="Calibri" w:eastAsia="Calibri"/>
-                <w:b w:val="0"/>
-                <w:color w:val="2B2B2B"/>
-                <w:sz w:val="20"/>
-              </w:rPr>
-              <w:t>Sustentación / cierre</w:t>
-            </w:r>
-          </w:p>
-        </w:tc>
-        <w:tc>
-          <w:tcPr>
-            <w:tcW w:type="dxa" w:w="2448"/>
-          </w:tcPr>
-          <w:p>
-            <w:r/>
-            <w:r>
-              <w:rPr>
-                <w:rFonts w:ascii="Calibri" w:hAnsi="Calibri" w:eastAsia="Calibri"/>
-                <w:b w:val="0"/>
-                <w:color w:val="2B2B2B"/>
-                <w:sz w:val="20"/>
-              </w:rPr>
-              <w:t>Sesión 13 (Clase 15)</w:t>
-            </w:r>
-          </w:p>
-        </w:tc>
-        <w:tc>
-          <w:tcPr>
-            <w:tcW w:type="dxa" w:w="2448"/>
-          </w:tcPr>
-          <w:p>
-            <w:r/>
-            <w:r>
-              <w:rPr>
-                <w:rFonts w:ascii="Calibri" w:hAnsi="Calibri" w:eastAsia="Calibri"/>
-                <w:b w:val="0"/>
-                <w:color w:val="2B2B2B"/>
-                <w:sz w:val="20"/>
-              </w:rPr>
-              <w:t>16/11/2026</w:t>
-            </w:r>
-          </w:p>
-        </w:tc>
-        <w:tc>
-          <w:tcPr>
-            <w:tcW w:type="dxa" w:w="2448"/>
-          </w:tcPr>
-          <w:p>
-            <w:r/>
-            <w:r>
-              <w:rPr>
-                <w:rFonts w:ascii="Calibri" w:hAnsi="Calibri" w:eastAsia="Calibri"/>
-                <w:b w:val="0"/>
-                <w:color w:val="2B2B2B"/>
-                <w:sz w:val="20"/>
-              </w:rPr>
-              <w:t>Defensa en vivo del PI CloudLite (15 min + 5 de preguntas) + cierre del curso</w:t>
-            </w:r>
-          </w:p>
-        </w:tc>
-      </w:tr>
-    </w:tbl>
-    <w:p>
-      <w:pPr>
-        <w:spacing w:after="80" w:before="0"/>
-        <w:jc w:val="left"/>
-      </w:pPr>
-    </w:p>
-    <w:p>
-      <w:pPr>
-        <w:spacing w:after="120" w:before="0"/>
-        <w:jc w:val="left"/>
-      </w:pPr>
-      <w:r>
-        <w:rPr>
-          <w:rFonts w:ascii="Calibri" w:hAnsi="Calibri" w:eastAsia="Calibri"/>
-          <w:b w:val="0"/>
-          <w:color w:val="2B2B2B"/>
-          <w:sz w:val="22"/>
-        </w:rPr>
-        <w:t>Nota: la sesión 13 (16/11) cae en festivo, pero por decisión docente es la sesión de sustentaciones: no es autónoma y no es parcial. El Parcial 3 es el 09/11 (sesión 12 · material Clase 14).</w:t>
-      </w:r>
-    </w:p>
-    <w:p>
-      <w:pPr>
-        <w:spacing w:after="120" w:before="240"/>
-        <w:jc w:val="left"/>
-      </w:pPr>
-      <w:r>
-        <w:rPr>
-          <w:rFonts w:ascii="Calibri" w:hAnsi="Calibri" w:eastAsia="Calibri"/>
-          <w:b/>
-          <w:color w:val="095292"/>
-          <w:sz w:val="24"/>
-        </w:rPr>
-        <w:t>5. Herramientas (gratis + navegador)</w:t>
-      </w:r>
-    </w:p>
-    <w:p>
-      <w:pPr>
-        <w:pStyle w:val="ListBullet"/>
-        <w:spacing w:after="40"/>
-      </w:pPr>
-      <w:r>
-        <w:rPr>
-          <w:rFonts w:ascii="Calibri" w:hAnsi="Calibri" w:eastAsia="Calibri"/>
-          <w:b w:val="0"/>
-          <w:color w:val="2B2B2B"/>
-          <w:sz w:val="22"/>
-        </w:rPr>
-        <w:t>Diagramas: draw.io / diagrams.net · Excalidraw.</w:t>
-      </w:r>
-    </w:p>
-    <w:p>
-      <w:pPr>
-        <w:pStyle w:val="ListBullet"/>
-        <w:spacing w:after="40"/>
-      </w:pPr>
-      <w:r>
-        <w:rPr>
-          <w:rFonts w:ascii="Calibri" w:hAnsi="Calibri" w:eastAsia="Calibri"/>
-          <w:b w:val="0"/>
-          <w:color w:val="2B2B2B"/>
-          <w:sz w:val="22"/>
-        </w:rPr>
-        <w:t>Contenedores: LabEx Docker Playground · Killercoda (sin Docker Desktop obligatorio).</w:t>
-      </w:r>
-    </w:p>
-    <w:p>
-      <w:pPr>
-        <w:pStyle w:val="ListBullet"/>
-        <w:spacing w:after="40"/>
-      </w:pPr>
-      <w:r>
-        <w:rPr>
-          <w:rFonts w:ascii="Calibri" w:hAnsi="Calibri" w:eastAsia="Calibri"/>
-          <w:b w:val="0"/>
-          <w:color w:val="2B2B2B"/>
-          <w:sz w:val="22"/>
-        </w:rPr>
-        <w:t>CI/CD: GitHub Actions (cuenta free) — pipelines simples.</w:t>
-      </w:r>
-    </w:p>
-    <w:p>
-      <w:pPr>
-        <w:pStyle w:val="ListBullet"/>
-        <w:spacing w:after="40"/>
-      </w:pPr>
-      <w:r>
-        <w:rPr>
-          <w:rFonts w:ascii="Calibri" w:hAnsi="Calibri" w:eastAsia="Calibri"/>
-          <w:b w:val="0"/>
-          <w:color w:val="2B2B2B"/>
-          <w:sz w:val="22"/>
-        </w:rPr>
-        <w:t>Entrega: documento propio, dentro del .zip que se sube a la plataforma del curso.</w:t>
-      </w:r>
-    </w:p>
-    <w:p>
-      <w:pPr>
-        <w:spacing w:after="160" w:before="0"/>
-        <w:jc w:val="left"/>
-        <w:shd w:val="clear" w:fill="FBE4E4"/>
-      </w:pPr>
-      <w:r>
-        <w:rPr>
-          <w:rFonts w:ascii="Calibri" w:hAnsi="Calibri" w:eastAsia="Calibri"/>
-          <w:b w:val="0"/>
-          <w:color w:val="2B2B2B"/>
-          <w:sz w:val="22"/>
-        </w:rPr>
-        <w:t>Prohibido como requisito: AWS/GCP/Oracle Cloud/Azure Free Tier con tarjeta; instalar VirtualBox/VMware/Docker Desktop/WSL; software de modelado de pago.</w:t>
-      </w:r>
-    </w:p>
-    <w:p>
-      <w:pPr>
-        <w:spacing w:after="120" w:before="240"/>
-        <w:jc w:val="left"/>
-      </w:pPr>
-      <w:r>
-        <w:rPr>
-          <w:rFonts w:ascii="Calibri" w:hAnsi="Calibri" w:eastAsia="Calibri"/>
-          <w:b/>
-          <w:color w:val="095292"/>
-          <w:sz w:val="24"/>
-        </w:rPr>
-        <w:t>6. Criterios de evaluación (rúbrica resumida — 100 pts → 20% del corte)</w:t>
-      </w:r>
-    </w:p>
-    <w:tbl>
-      <w:tblPr>
-        <w:tblStyle w:val="TableGrid"/>
-        <w:tblW w:type="auto" w:w="0"/>
-        <w:tblLook w:firstColumn="1" w:firstRow="1" w:lastColumn="0" w:lastRow="0" w:noHBand="0" w:noVBand="1" w:val="04A0"/>
-      </w:tblPr>
-      <w:tblGrid>
-        <w:gridCol w:w="3264"/>
-        <w:gridCol w:w="3264"/>
-        <w:gridCol w:w="3264"/>
-      </w:tblGrid>
-      <w:tr>
-        <w:tc>
-          <w:tcPr>
-            <w:tcW w:type="dxa" w:w="3264"/>
-            <w:shd w:val="clear" w:fill="095292"/>
-          </w:tcPr>
-          <w:p>
-            <w:r/>
-            <w:r>
-              <w:rPr>
-                <w:rFonts w:ascii="Calibri" w:hAnsi="Calibri" w:eastAsia="Calibri"/>
-                <w:b/>
-                <w:color w:val="FFFFFF"/>
-                <w:sz w:val="20"/>
-              </w:rPr>
-              <w:t>Criterio</w:t>
-            </w:r>
-          </w:p>
-        </w:tc>
-        <w:tc>
-          <w:tcPr>
-            <w:tcW w:type="dxa" w:w="3264"/>
-            <w:shd w:val="clear" w:fill="095292"/>
-          </w:tcPr>
-          <w:p>
-            <w:r/>
-            <w:r>
-              <w:rPr>
-                <w:rFonts w:ascii="Calibri" w:hAnsi="Calibri" w:eastAsia="Calibri"/>
-                <w:b/>
-                <w:color w:val="FFFFFF"/>
-                <w:sz w:val="20"/>
-              </w:rPr>
-              <w:t>Pts</w:t>
-            </w:r>
-          </w:p>
-        </w:tc>
-        <w:tc>
-          <w:tcPr>
-            <w:tcW w:type="dxa" w:w="3264"/>
-            <w:shd w:val="clear" w:fill="095292"/>
-          </w:tcPr>
-          <w:p>
-            <w:r/>
-            <w:r>
-              <w:rPr>
-                <w:rFonts w:ascii="Calibri" w:hAnsi="Calibri" w:eastAsia="Calibri"/>
-                <w:b/>
-                <w:color w:val="FFFFFF"/>
-                <w:sz w:val="20"/>
-              </w:rPr>
-              <w:t>Evidencia</w:t>
-            </w:r>
-          </w:p>
-        </w:tc>
-      </w:tr>
-      <w:tr>
-        <w:tc>
-          <w:tcPr>
-            <w:tcW w:type="dxa" w:w="3264"/>
-          </w:tcPr>
-          <w:p>
-            <w:r/>
-            <w:r>
-              <w:rPr>
-                <w:rFonts w:ascii="Calibri" w:hAnsi="Calibri" w:eastAsia="Calibri"/>
-                <w:b w:val="0"/>
-                <w:color w:val="2B2B2B"/>
-                <w:sz w:val="20"/>
-              </w:rPr>
-              <w:t>Dominio + decisión IaaS/PaaS/SaaS</w:t>
-            </w:r>
-          </w:p>
-        </w:tc>
-        <w:tc>
-          <w:tcPr>
-            <w:tcW w:type="dxa" w:w="3264"/>
-          </w:tcPr>
-          <w:p>
-            <w:r/>
-            <w:r>
-              <w:rPr>
-                <w:rFonts w:ascii="Calibri" w:hAnsi="Calibri" w:eastAsia="Calibri"/>
-                <w:b w:val="0"/>
-                <w:color w:val="2B2B2B"/>
-                <w:sz w:val="20"/>
-              </w:rPr>
-              <w:t>15</w:t>
-            </w:r>
-          </w:p>
-        </w:tc>
-        <w:tc>
-          <w:tcPr>
-            <w:tcW w:type="dxa" w:w="3264"/>
-          </w:tcPr>
-          <w:p>
-            <w:r/>
-            <w:r>
-              <w:rPr>
-                <w:rFonts w:ascii="Calibri" w:hAnsi="Calibri" w:eastAsia="Calibri"/>
-                <w:b w:val="0"/>
-                <w:color w:val="2B2B2B"/>
-                <w:sz w:val="20"/>
-              </w:rPr>
-              <w:t>Justificación clara</w:t>
-            </w:r>
-          </w:p>
-        </w:tc>
-      </w:tr>
-      <w:tr>
-        <w:tc>
-          <w:tcPr>
-            <w:tcW w:type="dxa" w:w="3264"/>
-            <w:shd w:val="clear" w:fill="F2F2F2"/>
-          </w:tcPr>
-          <w:p>
-            <w:r/>
-            <w:r>
-              <w:rPr>
-                <w:rFonts w:ascii="Calibri" w:hAnsi="Calibri" w:eastAsia="Calibri"/>
-                <w:b w:val="0"/>
-                <w:color w:val="2B2B2B"/>
-                <w:sz w:val="20"/>
-              </w:rPr>
-              <w:t>Diagramas de arquitectura</w:t>
-            </w:r>
-          </w:p>
-        </w:tc>
-        <w:tc>
-          <w:tcPr>
-            <w:tcW w:type="dxa" w:w="3264"/>
-            <w:shd w:val="clear" w:fill="F2F2F2"/>
-          </w:tcPr>
-          <w:p>
-            <w:r/>
-            <w:r>
-              <w:rPr>
-                <w:rFonts w:ascii="Calibri" w:hAnsi="Calibri" w:eastAsia="Calibri"/>
-                <w:b w:val="0"/>
-                <w:color w:val="2B2B2B"/>
-                <w:sz w:val="20"/>
-              </w:rPr>
-              <w:t>25</w:t>
-            </w:r>
-          </w:p>
-        </w:tc>
-        <w:tc>
-          <w:tcPr>
-            <w:tcW w:type="dxa" w:w="3264"/>
-            <w:shd w:val="clear" w:fill="F2F2F2"/>
-          </w:tcPr>
-          <w:p>
-            <w:r/>
-            <w:r>
-              <w:rPr>
-                <w:rFonts w:ascii="Calibri" w:hAnsi="Calibri" w:eastAsia="Calibri"/>
-                <w:b w:val="0"/>
-                <w:color w:val="2B2B2B"/>
-                <w:sz w:val="20"/>
-              </w:rPr>
-              <w:t>Componentes + despliegue</w:t>
-            </w:r>
-          </w:p>
-        </w:tc>
-      </w:tr>
-      <w:tr>
-        <w:tc>
-          <w:tcPr>
-            <w:tcW w:type="dxa" w:w="3264"/>
-          </w:tcPr>
-          <w:p>
-            <w:r/>
-            <w:r>
-              <w:rPr>
-                <w:rFonts w:ascii="Calibri" w:hAnsi="Calibri" w:eastAsia="Calibri"/>
-                <w:b w:val="0"/>
-                <w:color w:val="2B2B2B"/>
-                <w:sz w:val="20"/>
-              </w:rPr>
-              <w:t>Contenedores (lab navegador)</w:t>
-            </w:r>
-          </w:p>
-        </w:tc>
-        <w:tc>
-          <w:tcPr>
-            <w:tcW w:type="dxa" w:w="3264"/>
-          </w:tcPr>
-          <w:p>
-            <w:r/>
-            <w:r>
-              <w:rPr>
-                <w:rFonts w:ascii="Calibri" w:hAnsi="Calibri" w:eastAsia="Calibri"/>
-                <w:b w:val="0"/>
-                <w:color w:val="2B2B2B"/>
-                <w:sz w:val="20"/>
-              </w:rPr>
-              <w:t>20</w:t>
-            </w:r>
-          </w:p>
-        </w:tc>
-        <w:tc>
-          <w:tcPr>
-            <w:tcW w:type="dxa" w:w="3264"/>
-          </w:tcPr>
-          <w:p>
-            <w:r/>
-            <w:r>
-              <w:rPr>
-                <w:rFonts w:ascii="Calibri" w:hAnsi="Calibri" w:eastAsia="Calibri"/>
-                <w:b w:val="0"/>
-                <w:color w:val="2B2B2B"/>
-                <w:sz w:val="20"/>
-              </w:rPr>
-              <w:t>Dockerfile/compose + captura</w:t>
-            </w:r>
-          </w:p>
-        </w:tc>
-      </w:tr>
-      <w:tr>
-        <w:tc>
-          <w:tcPr>
-            <w:tcW w:type="dxa" w:w="3264"/>
-            <w:shd w:val="clear" w:fill="F2F2F2"/>
-          </w:tcPr>
-          <w:p>
-            <w:r/>
-            <w:r>
-              <w:rPr>
-                <w:rFonts w:ascii="Calibri" w:hAnsi="Calibri" w:eastAsia="Calibri"/>
-                <w:b w:val="0"/>
-                <w:color w:val="2B2B2B"/>
-                <w:sz w:val="20"/>
-              </w:rPr>
-              <w:t>CI/CD conceptual</w:t>
-            </w:r>
-          </w:p>
-        </w:tc>
-        <w:tc>
-          <w:tcPr>
-            <w:tcW w:type="dxa" w:w="3264"/>
-            <w:shd w:val="clear" w:fill="F2F2F2"/>
-          </w:tcPr>
-          <w:p>
-            <w:r/>
-            <w:r>
-              <w:rPr>
-                <w:rFonts w:ascii="Calibri" w:hAnsi="Calibri" w:eastAsia="Calibri"/>
-                <w:b w:val="0"/>
-                <w:color w:val="2B2B2B"/>
-                <w:sz w:val="20"/>
-              </w:rPr>
-              <w:t>15</w:t>
-            </w:r>
-          </w:p>
-        </w:tc>
-        <w:tc>
-          <w:tcPr>
-            <w:tcW w:type="dxa" w:w="3264"/>
-            <w:shd w:val="clear" w:fill="F2F2F2"/>
-          </w:tcPr>
-          <w:p>
-            <w:r/>
-            <w:r>
-              <w:rPr>
-                <w:rFonts w:ascii="Calibri" w:hAnsi="Calibri" w:eastAsia="Calibri"/>
-                <w:b w:val="0"/>
-                <w:color w:val="2B2B2B"/>
-                <w:sz w:val="20"/>
-              </w:rPr>
-              <w:t>Workflow .yml + explicación</w:t>
-            </w:r>
-          </w:p>
-        </w:tc>
-      </w:tr>
-      <w:tr>
-        <w:tc>
-          <w:tcPr>
-            <w:tcW w:type="dxa" w:w="3264"/>
-          </w:tcPr>
-          <w:p>
-            <w:r/>
-            <w:r>
-              <w:rPr>
-                <w:rFonts w:ascii="Calibri" w:hAnsi="Calibri" w:eastAsia="Calibri"/>
-                <w:b w:val="0"/>
-                <w:color w:val="2B2B2B"/>
-                <w:sz w:val="20"/>
-              </w:rPr>
-              <w:t>Seguridad / costos / escalabilidad</w:t>
-            </w:r>
-          </w:p>
-        </w:tc>
-        <w:tc>
-          <w:tcPr>
-            <w:tcW w:type="dxa" w:w="3264"/>
-          </w:tcPr>
-          <w:p>
-            <w:r/>
-            <w:r>
-              <w:rPr>
-                <w:rFonts w:ascii="Calibri" w:hAnsi="Calibri" w:eastAsia="Calibri"/>
-                <w:b w:val="0"/>
-                <w:color w:val="2B2B2B"/>
-                <w:sz w:val="20"/>
-              </w:rPr>
-              <w:t>10</w:t>
-            </w:r>
-          </w:p>
-        </w:tc>
-        <w:tc>
-          <w:tcPr>
-            <w:tcW w:type="dxa" w:w="3264"/>
-          </w:tcPr>
-          <w:p>
-            <w:r/>
-            <w:r>
-              <w:rPr>
-                <w:rFonts w:ascii="Calibri" w:hAnsi="Calibri" w:eastAsia="Calibri"/>
-                <w:b w:val="0"/>
-                <w:color w:val="2B2B2B"/>
-                <w:sz w:val="20"/>
-              </w:rPr>
-              <w:t>Sección en informe</w:t>
-            </w:r>
-          </w:p>
-        </w:tc>
-      </w:tr>
-      <w:tr>
-        <w:tc>
-          <w:tcPr>
-            <w:tcW w:type="dxa" w:w="3264"/>
-            <w:shd w:val="clear" w:fill="F2F2F2"/>
-          </w:tcPr>
-          <w:p>
-            <w:r/>
-            <w:r>
-              <w:rPr>
-                <w:rFonts w:ascii="Calibri" w:hAnsi="Calibri" w:eastAsia="Calibri"/>
-                <w:b w:val="0"/>
-                <w:color w:val="2B2B2B"/>
-                <w:sz w:val="20"/>
-              </w:rPr>
-              <w:t>Informe + sustentación</w:t>
-            </w:r>
-          </w:p>
-        </w:tc>
-        <w:tc>
-          <w:tcPr>
-            <w:tcW w:type="dxa" w:w="3264"/>
-            <w:shd w:val="clear" w:fill="F2F2F2"/>
-          </w:tcPr>
-          <w:p>
-            <w:r/>
-            <w:r>
-              <w:rPr>
-                <w:rFonts w:ascii="Calibri" w:hAnsi="Calibri" w:eastAsia="Calibri"/>
-                <w:b w:val="0"/>
-                <w:color w:val="2B2B2B"/>
-                <w:sz w:val="20"/>
-              </w:rPr>
-              <w:t>15</w:t>
-            </w:r>
-          </w:p>
-        </w:tc>
-        <w:tc>
-          <w:tcPr>
-            <w:tcW w:type="dxa" w:w="3264"/>
-            <w:shd w:val="clear" w:fill="F2F2F2"/>
-          </w:tcPr>
-          <w:p>
-            <w:r/>
-            <w:r>
-              <w:rPr>
-                <w:rFonts w:ascii="Calibri" w:hAnsi="Calibri" w:eastAsia="Calibri"/>
-                <w:b w:val="0"/>
-                <w:color w:val="2B2B2B"/>
-                <w:sz w:val="20"/>
-              </w:rPr>
-              <w:t>Claridad, demo, respuestas</w:t>
+              <w:t>Las etapas de construir y probar, que pasan; el despliegue puede ser simulado.</w:t>
             </w:r>
           </w:p>
         </w:tc>
@@ -1549,62 +721,410 @@
           <w:color w:val="095292"/>
           <w:sz w:val="24"/>
         </w:rPr>
-        <w:t>7. Modalidad de trabajo</w:t>
+        <w:t>3. Cómo se califica (100 puntos)</w:t>
       </w:r>
     </w:p>
+    <w:tbl>
+      <w:tblPr>
+        <w:tblStyle w:val="TableGrid"/>
+        <w:tblW w:type="auto" w:w="0"/>
+        <w:tblLayout w:type="fixed"/>
+        <w:tblLook w:firstColumn="1" w:firstRow="1" w:lastColumn="0" w:lastRow="0" w:noHBand="0" w:noVBand="1" w:val="04A0"/>
+      </w:tblPr>
+      <w:tblGrid>
+        <w:gridCol w:w="3264"/>
+        <w:gridCol w:w="3264"/>
+        <w:gridCol w:w="3264"/>
+      </w:tblGrid>
+      <w:tr>
+        <w:tc>
+          <w:tcPr>
+            <w:tcW w:type="dxa" w:w="3024"/>
+            <w:shd w:val="clear" w:fill="095292"/>
+          </w:tcPr>
+          <w:p>
+            <w:r/>
+            <w:r>
+              <w:rPr>
+                <w:rFonts w:ascii="Calibri" w:hAnsi="Calibri" w:eastAsia="Calibri"/>
+                <w:b/>
+                <w:color w:val="FFFFFF"/>
+                <w:sz w:val="20"/>
+              </w:rPr>
+              <w:t>Criterio</w:t>
+            </w:r>
+          </w:p>
+        </w:tc>
+        <w:tc>
+          <w:tcPr>
+            <w:tcW w:type="dxa" w:w="720"/>
+            <w:shd w:val="clear" w:fill="095292"/>
+          </w:tcPr>
+          <w:p>
+            <w:r/>
+            <w:r>
+              <w:rPr>
+                <w:rFonts w:ascii="Calibri" w:hAnsi="Calibri" w:eastAsia="Calibri"/>
+                <w:b/>
+                <w:color w:val="FFFFFF"/>
+                <w:sz w:val="20"/>
+              </w:rPr>
+              <w:t>Pts</w:t>
+            </w:r>
+          </w:p>
+        </w:tc>
+        <w:tc>
+          <w:tcPr>
+            <w:tcW w:type="dxa" w:w="6048"/>
+            <w:shd w:val="clear" w:fill="095292"/>
+          </w:tcPr>
+          <w:p>
+            <w:r/>
+            <w:r>
+              <w:rPr>
+                <w:rFonts w:ascii="Calibri" w:hAnsi="Calibri" w:eastAsia="Calibri"/>
+                <w:b/>
+                <w:color w:val="FFFFFF"/>
+                <w:sz w:val="20"/>
+              </w:rPr>
+              <w:t>Qué se mira</w:t>
+            </w:r>
+          </w:p>
+        </w:tc>
+      </w:tr>
+      <w:tr>
+        <w:tc>
+          <w:tcPr>
+            <w:tcW w:type="dxa" w:w="3024"/>
+          </w:tcPr>
+          <w:p>
+            <w:r/>
+            <w:r>
+              <w:rPr>
+                <w:rFonts w:ascii="Calibri" w:hAnsi="Calibri" w:eastAsia="Calibri"/>
+                <w:b w:val="0"/>
+                <w:color w:val="2B2B2B"/>
+                <w:sz w:val="20"/>
+              </w:rPr>
+              <w:t>Dominio y modelo de servicio</w:t>
+            </w:r>
+          </w:p>
+        </w:tc>
+        <w:tc>
+          <w:tcPr>
+            <w:tcW w:type="dxa" w:w="720"/>
+          </w:tcPr>
+          <w:p>
+            <w:r/>
+            <w:r>
+              <w:rPr>
+                <w:rFonts w:ascii="Calibri" w:hAnsi="Calibri" w:eastAsia="Calibri"/>
+                <w:b w:val="0"/>
+                <w:color w:val="2B2B2B"/>
+                <w:sz w:val="20"/>
+              </w:rPr>
+              <w:t>15</w:t>
+            </w:r>
+          </w:p>
+        </w:tc>
+        <w:tc>
+          <w:tcPr>
+            <w:tcW w:type="dxa" w:w="6048"/>
+          </w:tcPr>
+          <w:p>
+            <w:r/>
+            <w:r>
+              <w:rPr>
+                <w:rFonts w:ascii="Calibri" w:hAnsi="Calibri" w:eastAsia="Calibri"/>
+                <w:b w:val="0"/>
+                <w:color w:val="2B2B2B"/>
+                <w:sz w:val="20"/>
+              </w:rPr>
+              <w:t>Un problema concreto y la decisión IaaS, PaaS o SaaS justificada.</w:t>
+            </w:r>
+          </w:p>
+        </w:tc>
+      </w:tr>
+      <w:tr>
+        <w:tc>
+          <w:tcPr>
+            <w:tcW w:type="dxa" w:w="3024"/>
+            <w:shd w:val="clear" w:fill="F2F2F2"/>
+          </w:tcPr>
+          <w:p>
+            <w:r/>
+            <w:r>
+              <w:rPr>
+                <w:rFonts w:ascii="Calibri" w:hAnsi="Calibri" w:eastAsia="Calibri"/>
+                <w:b w:val="0"/>
+                <w:color w:val="2B2B2B"/>
+                <w:sz w:val="20"/>
+              </w:rPr>
+              <w:t>Diagramas</w:t>
+            </w:r>
+          </w:p>
+        </w:tc>
+        <w:tc>
+          <w:tcPr>
+            <w:tcW w:type="dxa" w:w="720"/>
+            <w:shd w:val="clear" w:fill="F2F2F2"/>
+          </w:tcPr>
+          <w:p>
+            <w:r/>
+            <w:r>
+              <w:rPr>
+                <w:rFonts w:ascii="Calibri" w:hAnsi="Calibri" w:eastAsia="Calibri"/>
+                <w:b w:val="0"/>
+                <w:color w:val="2B2B2B"/>
+                <w:sz w:val="20"/>
+              </w:rPr>
+              <w:t>25</w:t>
+            </w:r>
+          </w:p>
+        </w:tc>
+        <w:tc>
+          <w:tcPr>
+            <w:tcW w:type="dxa" w:w="6048"/>
+            <w:shd w:val="clear" w:fill="F2F2F2"/>
+          </w:tcPr>
+          <w:p>
+            <w:r/>
+            <w:r>
+              <w:rPr>
+                <w:rFonts w:ascii="Calibri" w:hAnsi="Calibri" w:eastAsia="Calibri"/>
+                <w:b w:val="0"/>
+                <w:color w:val="2B2B2B"/>
+                <w:sz w:val="20"/>
+              </w:rPr>
+              <w:t>Legibles, con la notación correcta y los mismos nombres en los tres.</w:t>
+            </w:r>
+          </w:p>
+        </w:tc>
+      </w:tr>
+      <w:tr>
+        <w:tc>
+          <w:tcPr>
+            <w:tcW w:type="dxa" w:w="3024"/>
+          </w:tcPr>
+          <w:p>
+            <w:r/>
+            <w:r>
+              <w:rPr>
+                <w:rFonts w:ascii="Calibri" w:hAnsi="Calibri" w:eastAsia="Calibri"/>
+                <w:b w:val="0"/>
+                <w:color w:val="2B2B2B"/>
+                <w:sz w:val="20"/>
+              </w:rPr>
+              <w:t>Contenedores</w:t>
+            </w:r>
+          </w:p>
+        </w:tc>
+        <w:tc>
+          <w:tcPr>
+            <w:tcW w:type="dxa" w:w="720"/>
+          </w:tcPr>
+          <w:p>
+            <w:r/>
+            <w:r>
+              <w:rPr>
+                <w:rFonts w:ascii="Calibri" w:hAnsi="Calibri" w:eastAsia="Calibri"/>
+                <w:b w:val="0"/>
+                <w:color w:val="2B2B2B"/>
+                <w:sz w:val="20"/>
+              </w:rPr>
+              <w:t>20</w:t>
+            </w:r>
+          </w:p>
+        </w:tc>
+        <w:tc>
+          <w:tcPr>
+            <w:tcW w:type="dxa" w:w="6048"/>
+          </w:tcPr>
+          <w:p>
+            <w:r/>
+            <w:r>
+              <w:rPr>
+                <w:rFonts w:ascii="Calibri" w:hAnsi="Calibri" w:eastAsia="Calibri"/>
+                <w:b w:val="0"/>
+                <w:color w:val="2B2B2B"/>
+                <w:sz w:val="20"/>
+              </w:rPr>
+              <w:t>El Dockerfile y el servicio corriendo en el lab.</w:t>
+            </w:r>
+          </w:p>
+        </w:tc>
+      </w:tr>
+      <w:tr>
+        <w:tc>
+          <w:tcPr>
+            <w:tcW w:type="dxa" w:w="3024"/>
+            <w:shd w:val="clear" w:fill="F2F2F2"/>
+          </w:tcPr>
+          <w:p>
+            <w:r/>
+            <w:r>
+              <w:rPr>
+                <w:rFonts w:ascii="Calibri" w:hAnsi="Calibri" w:eastAsia="Calibri"/>
+                <w:b w:val="0"/>
+                <w:color w:val="2B2B2B"/>
+                <w:sz w:val="20"/>
+              </w:rPr>
+              <w:t>CI/CD</w:t>
+            </w:r>
+          </w:p>
+        </w:tc>
+        <w:tc>
+          <w:tcPr>
+            <w:tcW w:type="dxa" w:w="720"/>
+            <w:shd w:val="clear" w:fill="F2F2F2"/>
+          </w:tcPr>
+          <w:p>
+            <w:r/>
+            <w:r>
+              <w:rPr>
+                <w:rFonts w:ascii="Calibri" w:hAnsi="Calibri" w:eastAsia="Calibri"/>
+                <w:b w:val="0"/>
+                <w:color w:val="2B2B2B"/>
+                <w:sz w:val="20"/>
+              </w:rPr>
+              <w:t>15</w:t>
+            </w:r>
+          </w:p>
+        </w:tc>
+        <w:tc>
+          <w:tcPr>
+            <w:tcW w:type="dxa" w:w="6048"/>
+            <w:shd w:val="clear" w:fill="F2F2F2"/>
+          </w:tcPr>
+          <w:p>
+            <w:r/>
+            <w:r>
+              <w:rPr>
+                <w:rFonts w:ascii="Calibri" w:hAnsi="Calibri" w:eastAsia="Calibri"/>
+                <w:b w:val="0"/>
+                <w:color w:val="2B2B2B"/>
+                <w:sz w:val="20"/>
+              </w:rPr>
+              <w:t>Etapas claras que construyen y prueban.</w:t>
+            </w:r>
+          </w:p>
+        </w:tc>
+      </w:tr>
+      <w:tr>
+        <w:tc>
+          <w:tcPr>
+            <w:tcW w:type="dxa" w:w="3024"/>
+          </w:tcPr>
+          <w:p>
+            <w:r/>
+            <w:r>
+              <w:rPr>
+                <w:rFonts w:ascii="Calibri" w:hAnsi="Calibri" w:eastAsia="Calibri"/>
+                <w:b w:val="0"/>
+                <w:color w:val="2B2B2B"/>
+                <w:sz w:val="20"/>
+              </w:rPr>
+              <w:t>Seguridad, costos y escalabilidad</w:t>
+            </w:r>
+          </w:p>
+        </w:tc>
+        <w:tc>
+          <w:tcPr>
+            <w:tcW w:type="dxa" w:w="720"/>
+          </w:tcPr>
+          <w:p>
+            <w:r/>
+            <w:r>
+              <w:rPr>
+                <w:rFonts w:ascii="Calibri" w:hAnsi="Calibri" w:eastAsia="Calibri"/>
+                <w:b w:val="0"/>
+                <w:color w:val="2B2B2B"/>
+                <w:sz w:val="20"/>
+              </w:rPr>
+              <w:t>10</w:t>
+            </w:r>
+          </w:p>
+        </w:tc>
+        <w:tc>
+          <w:tcPr>
+            <w:tcW w:type="dxa" w:w="6048"/>
+          </w:tcPr>
+          <w:p>
+            <w:r/>
+            <w:r>
+              <w:rPr>
+                <w:rFonts w:ascii="Calibri" w:hAnsi="Calibri" w:eastAsia="Calibri"/>
+                <w:b w:val="0"/>
+                <w:color w:val="2B2B2B"/>
+                <w:sz w:val="20"/>
+              </w:rPr>
+              <w:t>Amenazas, costo por componente y cómo escala.</w:t>
+            </w:r>
+          </w:p>
+        </w:tc>
+      </w:tr>
+      <w:tr>
+        <w:tc>
+          <w:tcPr>
+            <w:tcW w:type="dxa" w:w="3024"/>
+            <w:shd w:val="clear" w:fill="F2F2F2"/>
+          </w:tcPr>
+          <w:p>
+            <w:r/>
+            <w:r>
+              <w:rPr>
+                <w:rFonts w:ascii="Calibri" w:hAnsi="Calibri" w:eastAsia="Calibri"/>
+                <w:b w:val="0"/>
+                <w:color w:val="2B2B2B"/>
+                <w:sz w:val="20"/>
+              </w:rPr>
+              <w:t>Documento y sustentación</w:t>
+            </w:r>
+          </w:p>
+        </w:tc>
+        <w:tc>
+          <w:tcPr>
+            <w:tcW w:type="dxa" w:w="720"/>
+            <w:shd w:val="clear" w:fill="F2F2F2"/>
+          </w:tcPr>
+          <w:p>
+            <w:r/>
+            <w:r>
+              <w:rPr>
+                <w:rFonts w:ascii="Calibri" w:hAnsi="Calibri" w:eastAsia="Calibri"/>
+                <w:b w:val="0"/>
+                <w:color w:val="2B2B2B"/>
+                <w:sz w:val="20"/>
+              </w:rPr>
+              <w:t>15</w:t>
+            </w:r>
+          </w:p>
+        </w:tc>
+        <w:tc>
+          <w:tcPr>
+            <w:tcW w:type="dxa" w:w="6048"/>
+            <w:shd w:val="clear" w:fill="F2F2F2"/>
+          </w:tcPr>
+          <w:p>
+            <w:r/>
+            <w:r>
+              <w:rPr>
+                <w:rFonts w:ascii="Calibri" w:hAnsi="Calibri" w:eastAsia="Calibri"/>
+                <w:b w:val="0"/>
+                <w:color w:val="2B2B2B"/>
+                <w:sz w:val="20"/>
+              </w:rPr>
+              <w:t>Claridad, demostración y respuestas de todos.</w:t>
+            </w:r>
+          </w:p>
+        </w:tc>
+      </w:tr>
+    </w:tbl>
     <w:p>
       <w:pPr>
-        <w:pStyle w:val="ListBullet"/>
-        <w:spacing w:after="40"/>
+        <w:spacing w:after="80" w:before="0"/>
+        <w:jc w:val="left"/>
       </w:pPr>
-      <w:r>
-        <w:rPr>
-          <w:rFonts w:ascii="Calibri" w:hAnsi="Calibri" w:eastAsia="Calibri"/>
-          <w:b/>
-          <w:color w:val="2B2B2B"/>
-          <w:sz w:val="22"/>
-        </w:rPr>
-        <w:t>En equipo, no individual:</w:t>
-      </w:r>
-      <w:r>
-        <w:rPr>
-          <w:rFonts w:ascii="Calibri" w:hAnsi="Calibri" w:eastAsia="Calibri"/>
-          <w:b w:val="0"/>
-          <w:color w:val="2B2B2B"/>
-          <w:sz w:val="22"/>
-        </w:rPr>
-        <w:t xml:space="preserve"> equipos de 4 a 5 integrantes (máximo 5).</w:t>
-      </w:r>
-    </w:p>
-    <w:p>
-      <w:pPr>
-        <w:pStyle w:val="ListBullet"/>
-        <w:spacing w:after="40"/>
-      </w:pPr>
-      <w:r>
-        <w:rPr>
-          <w:rFonts w:ascii="Calibri" w:hAnsi="Calibri" w:eastAsia="Calibri"/>
-          <w:b w:val="0"/>
-          <w:color w:val="2B2B2B"/>
-          <w:sz w:val="22"/>
-        </w:rPr>
-        <w:t>Todo el equipo trabaja el proyecto completo: en la sustentación hablan todos, y cualquier integrante debe poder explicar los diagramas y el workflow CI/CD.</w:t>
-      </w:r>
-    </w:p>
-    <w:p>
-      <w:pPr>
-        <w:pStyle w:val="ListBullet"/>
-        <w:spacing w:after="40"/>
-      </w:pPr>
-      <w:r>
-        <w:rPr>
-          <w:rFonts w:ascii="Calibri" w:hAnsi="Calibri" w:eastAsia="Calibri"/>
-          <w:b w:val="0"/>
-          <w:color w:val="2B2B2B"/>
-          <w:sz w:val="22"/>
-        </w:rPr>
-        <w:t>Cada integrante sube la entrega del equipo desde su propia cuenta (sección 9).</w:t>
-      </w:r>
     </w:p>
     <w:p>
       <w:pPr>
@@ -1618,67 +1138,7 @@
           <w:color w:val="095292"/>
           <w:sz w:val="24"/>
         </w:rPr>
-        <w:t>8. Qué NO es este proyecto</w:t>
-      </w:r>
-    </w:p>
-    <w:p>
-      <w:pPr>
-        <w:pStyle w:val="ListBullet"/>
-        <w:spacing w:after="40"/>
-      </w:pPr>
-      <w:r>
-        <w:rPr>
-          <w:rFonts w:ascii="Calibri" w:hAnsi="Calibri" w:eastAsia="Calibri"/>
-          <w:b w:val="0"/>
-          <w:color w:val="2B2B2B"/>
-          <w:sz w:val="22"/>
-        </w:rPr>
-        <w:t>No sustituye el Parcial 3 (09/11, virtual síncrona por Meet).</w:t>
-      </w:r>
-    </w:p>
-    <w:p>
-      <w:pPr>
-        <w:pStyle w:val="ListBullet"/>
-        <w:spacing w:after="40"/>
-      </w:pPr>
-      <w:r>
-        <w:rPr>
-          <w:rFonts w:ascii="Calibri" w:hAnsi="Calibri" w:eastAsia="Calibri"/>
-          <w:b w:val="0"/>
-          <w:color w:val="2B2B2B"/>
-          <w:sz w:val="22"/>
-        </w:rPr>
-        <w:t>No exige cuenta cloud de pago ni gastos del estudiante.</w:t>
-      </w:r>
-    </w:p>
-    <w:p>
-      <w:pPr>
-        <w:pStyle w:val="ListBullet"/>
-        <w:spacing w:after="40"/>
-      </w:pPr>
-      <w:r>
-        <w:rPr>
-          <w:rFonts w:ascii="Calibri" w:hAnsi="Calibri" w:eastAsia="Calibri"/>
-          <w:b w:val="0"/>
-          <w:color w:val="2B2B2B"/>
-          <w:sz w:val="22"/>
-        </w:rPr>
-        <w:t>No se pide producción real en Internet: el foco es diseño + simulación en labs gratis.</w:t>
-      </w:r>
-    </w:p>
-    <w:p>
-      <w:pPr>
-        <w:spacing w:after="120" w:before="240"/>
-        <w:jc w:val="left"/>
-      </w:pPr>
-      <w:r>
-        <w:rPr>
-          <w:rFonts w:ascii="Calibri" w:hAnsi="Calibri" w:eastAsia="Calibri"/>
-          <w:b/>
-          <w:color w:val="095292"/>
-          <w:sz w:val="24"/>
-        </w:rPr>
-        <w:t>9. Entrega y sustentación</w:t>
+        <w:t>4. Entrega y sustentación</w:t>
       </w:r>
     </w:p>
     <w:p>
@@ -1726,235 +1186,7 @@
           <w:color w:val="2B2B2B"/>
           <w:sz w:val="22"/>
         </w:rPr>
-        <w:t xml:space="preserve"> un solo archivo .zip —dentro puede ir cualquier tipo de archivo; máximo 50 MB—, con esto adentro:</w:t>
-      </w:r>
-    </w:p>
-    <w:tbl>
-      <w:tblPr>
-        <w:tblStyle w:val="TableGrid"/>
-        <w:tblW w:type="auto" w:w="0"/>
-        <w:tblLayout w:type="fixed"/>
-        <w:tblLook w:firstColumn="1" w:firstRow="1" w:lastColumn="0" w:lastRow="0" w:noHBand="0" w:noVBand="1" w:val="04A0"/>
-      </w:tblPr>
-      <w:tblGrid>
-        <w:gridCol w:w="4896"/>
-        <w:gridCol w:w="4896"/>
-      </w:tblGrid>
-      <w:tr>
-        <w:tc>
-          <w:tcPr>
-            <w:tcW w:type="dxa" w:w="2448"/>
-            <w:shd w:val="clear" w:fill="095292"/>
-          </w:tcPr>
-          <w:p>
-            <w:r/>
-            <w:r>
-              <w:rPr>
-                <w:rFonts w:ascii="Calibri" w:hAnsi="Calibri" w:eastAsia="Calibri"/>
-                <w:b/>
-                <w:color w:val="FFFFFF"/>
-                <w:sz w:val="20"/>
-              </w:rPr>
-              <w:t>En el .zip</w:t>
-            </w:r>
-          </w:p>
-        </w:tc>
-        <w:tc>
-          <w:tcPr>
-            <w:tcW w:type="dxa" w:w="7344"/>
-            <w:shd w:val="clear" w:fill="095292"/>
-          </w:tcPr>
-          <w:p>
-            <w:r/>
-            <w:r>
-              <w:rPr>
-                <w:rFonts w:ascii="Calibri" w:hAnsi="Calibri" w:eastAsia="Calibri"/>
-                <w:b/>
-                <w:color w:val="FFFFFF"/>
-                <w:sz w:val="20"/>
-              </w:rPr>
-              <w:t>Qué contiene</w:t>
-            </w:r>
-          </w:p>
-        </w:tc>
-      </w:tr>
-      <w:tr>
-        <w:tc>
-          <w:tcPr>
-            <w:tcW w:type="dxa" w:w="2448"/>
-          </w:tcPr>
-          <w:p>
-            <w:r/>
-            <w:r>
-              <w:rPr>
-                <w:rFonts w:ascii="Calibri" w:hAnsi="Calibri" w:eastAsia="Calibri"/>
-                <w:b w:val="0"/>
-                <w:color w:val="2B2B2B"/>
-                <w:sz w:val="20"/>
-              </w:rPr>
-              <w:t>Documento de arquitectura</w:t>
-            </w:r>
-          </w:p>
-        </w:tc>
-        <w:tc>
-          <w:tcPr>
-            <w:tcW w:type="dxa" w:w="7344"/>
-          </w:tcPr>
-          <w:p>
-            <w:r/>
-            <w:r>
-              <w:rPr>
-                <w:rFonts w:ascii="Calibri" w:hAnsi="Calibri" w:eastAsia="Calibri"/>
-                <w:b w:val="0"/>
-                <w:color w:val="2B2B2B"/>
-                <w:sz w:val="20"/>
-              </w:rPr>
-              <w:t>PDF o DOCX: contexto, ADRs breves, riesgos, costos estimados en lenguaje cualitativo y las secciones de seguridad, monitoreo, rendimiento y escalabilidad.</w:t>
-            </w:r>
-          </w:p>
-        </w:tc>
-      </w:tr>
-      <w:tr>
-        <w:tc>
-          <w:tcPr>
-            <w:tcW w:type="dxa" w:w="2448"/>
-            <w:shd w:val="clear" w:fill="F2F2F2"/>
-          </w:tcPr>
-          <w:p>
-            <w:r/>
-            <w:r>
-              <w:rPr>
-                <w:rFonts w:ascii="Calibri" w:hAnsi="Calibri" w:eastAsia="Calibri"/>
-                <w:b w:val="0"/>
-                <w:color w:val="2B2B2B"/>
-                <w:sz w:val="20"/>
-              </w:rPr>
-              <w:t>diagramas/</w:t>
-            </w:r>
-          </w:p>
-        </w:tc>
-        <w:tc>
-          <w:tcPr>
-            <w:tcW w:type="dxa" w:w="7344"/>
-            <w:shd w:val="clear" w:fill="F2F2F2"/>
-          </w:tcPr>
-          <w:p>
-            <w:r/>
-            <w:r>
-              <w:rPr>
-                <w:rFonts w:ascii="Calibri" w:hAnsi="Calibri" w:eastAsia="Calibri"/>
-                <w:b w:val="0"/>
-                <w:color w:val="2B2B2B"/>
-                <w:sz w:val="20"/>
-              </w:rPr>
-              <w:t>Componentes (C4), despliegue y flujo CI/CD, exportados en PNG, con su archivo fuente (.drawio o el texto Mermaid).</w:t>
-            </w:r>
-          </w:p>
-        </w:tc>
-      </w:tr>
-      <w:tr>
-        <w:tc>
-          <w:tcPr>
-            <w:tcW w:type="dxa" w:w="2448"/>
-          </w:tcPr>
-          <w:p>
-            <w:r/>
-            <w:r>
-              <w:rPr>
-                <w:rFonts w:ascii="Calibri" w:hAnsi="Calibri" w:eastAsia="Calibri"/>
-                <w:b w:val="0"/>
-                <w:color w:val="2B2B2B"/>
-                <w:sz w:val="20"/>
-              </w:rPr>
-              <w:t>contenedores/</w:t>
-            </w:r>
-          </w:p>
-        </w:tc>
-        <w:tc>
-          <w:tcPr>
-            <w:tcW w:type="dxa" w:w="7344"/>
-          </w:tcPr>
-          <w:p>
-            <w:r/>
-            <w:r>
-              <w:rPr>
-                <w:rFonts w:ascii="Calibri" w:hAnsi="Calibri" w:eastAsia="Calibri"/>
-                <w:b w:val="0"/>
-                <w:color w:val="2B2B2B"/>
-                <w:sz w:val="20"/>
-              </w:rPr>
-              <w:t>El Dockerfile o el docker-compose.yml, y las capturas del lab (LabEx Docker Playground o Killercoda) con la fecha visible.</w:t>
-            </w:r>
-          </w:p>
-        </w:tc>
-      </w:tr>
-      <w:tr>
-        <w:tc>
-          <w:tcPr>
-            <w:tcW w:type="dxa" w:w="2448"/>
-            <w:shd w:val="clear" w:fill="F2F2F2"/>
-          </w:tcPr>
-          <w:p>
-            <w:r/>
-            <w:r>
-              <w:rPr>
-                <w:rFonts w:ascii="Calibri" w:hAnsi="Calibri" w:eastAsia="Calibri"/>
-                <w:b w:val="0"/>
-                <w:color w:val="2B2B2B"/>
-                <w:sz w:val="20"/>
-              </w:rPr>
-              <w:t>.github/workflows/</w:t>
-            </w:r>
-          </w:p>
-        </w:tc>
-        <w:tc>
-          <w:tcPr>
-            <w:tcW w:type="dxa" w:w="7344"/>
-            <w:shd w:val="clear" w:fill="F2F2F2"/>
-          </w:tcPr>
-          <w:p>
-            <w:r/>
-            <w:r>
-              <w:rPr>
-                <w:rFonts w:ascii="Calibri" w:hAnsi="Calibri" w:eastAsia="Calibri"/>
-                <w:b w:val="0"/>
-                <w:color w:val="2B2B2B"/>
-                <w:sz w:val="20"/>
-              </w:rPr>
-              <w:t>El workflow de GitHub Actions (.yml) y el stub que compila y prueba.</w:t>
-            </w:r>
-          </w:p>
-        </w:tc>
-      </w:tr>
-    </w:tbl>
-    <w:p>
-      <w:pPr>
-        <w:spacing w:after="80" w:before="0"/>
-        <w:jc w:val="left"/>
-      </w:pPr>
-    </w:p>
-    <w:p>
-      <w:pPr>
-        <w:pStyle w:val="ListBullet"/>
-        <w:spacing w:after="40"/>
-      </w:pPr>
-      <w:r>
-        <w:rPr>
-          <w:rFonts w:ascii="Calibri" w:hAnsi="Calibri" w:eastAsia="Calibri"/>
-          <w:b/>
-          <w:color w:val="2B2B2B"/>
-          <w:sz w:val="22"/>
-        </w:rPr>
-        <w:t>Enlace obligatorio:</w:t>
-      </w:r>
-      <w:r>
-        <w:rPr>
-          <w:rFonts w:ascii="Calibri" w:hAnsi="Calibri" w:eastAsia="Calibri"/>
-          <w:b w:val="0"/>
-          <w:color w:val="2B2B2B"/>
-          <w:sz w:val="22"/>
-        </w:rPr>
-        <w:t xml:space="preserve"> junto al .zip, el repositorio de GitHub donde está el workflow, o la carpeta de Drive del equipo si el workflow se entrega solo como archivo.</w:t>
+        <w:t xml:space="preserve"> el .zip (máximo 50 MB) y, junto a él, el repositorio de GitHub donde está el workflow, o la carpeta de Drive del equipo si el workflow se entrega solo como archivo.</w:t>
       </w:r>
     </w:p>
     <w:p>
@@ -2002,7 +1234,7 @@
           <w:color w:val="2B2B2B"/>
           <w:sz w:val="22"/>
         </w:rPr>
-        <w:t xml:space="preserve"> lunes 16/11/2026, en la última clase (sesión 13; es festivo, pero sí hay clase), por Meet: 15 minutos de exposición + 5 minutos de preguntas por equipo (turno de 20 minutos); hablan todos los integrantes.</w:t>
+        <w:t xml:space="preserve"> lunes 16/11/2026, en la última clase (es festivo, pero sí hay clase), por Meet: 15 minutos de exposición + 5 minutos de preguntas por equipo (turno de 20 minutos); hablan todos los integrantes.</w:t>
       </w:r>
     </w:p>
     <w:p>
@@ -2017,7 +1249,7 @@
           <w:color w:val="2B2B2B"/>
           <w:sz w:val="22"/>
         </w:rPr>
-        <w:t>Qué se muestra en la sustentación:</w:t>
+        <w:t>Qué se muestra:</w:t>
       </w:r>
       <w:r>
         <w:rPr>
@@ -2027,6 +1259,75 @@
           <w:sz w:val="22"/>
         </w:rPr>
         <w:t xml:space="preserve"> el diagrama de despliegue, el contenedor corriendo en el lab (o sus capturas, si la sesión del lab caducó) y el workflow con sus etapas.</w:t>
+      </w:r>
+    </w:p>
+    <w:p>
+      <w:pPr>
+        <w:spacing w:after="120" w:before="240"/>
+        <w:jc w:val="left"/>
+      </w:pPr>
+      <w:r>
+        <w:rPr>
+          <w:rFonts w:ascii="Calibri" w:hAnsi="Calibri" w:eastAsia="Calibri"/>
+          <w:b/>
+          <w:color w:val="095292"/>
+          <w:sz w:val="24"/>
+        </w:rPr>
+        <w:t>5. Reglas</w:t>
+      </w:r>
+    </w:p>
+    <w:p>
+      <w:pPr>
+        <w:pStyle w:val="ListBullet"/>
+        <w:spacing w:after="40"/>
+      </w:pPr>
+      <w:r>
+        <w:rPr>
+          <w:rFonts w:ascii="Calibri" w:hAnsi="Calibri" w:eastAsia="Calibri"/>
+          <w:b/>
+          <w:color w:val="2B2B2B"/>
+          <w:sz w:val="22"/>
+        </w:rPr>
+        <w:t>Equipo de 4 a 5 integrantes (máximo 5)</w:t>
+      </w:r>
+      <w:r>
+        <w:rPr>
+          <w:rFonts w:ascii="Calibri" w:hAnsi="Calibri" w:eastAsia="Calibri"/>
+          <w:b w:val="0"/>
+          <w:color w:val="2B2B2B"/>
+          <w:sz w:val="22"/>
+        </w:rPr>
+        <w:t>, el mismo hasta el final. Es regla solo del proyecto: talleres, quices y parciales tienen su propia modalidad.</w:t>
+      </w:r>
+    </w:p>
+    <w:p>
+      <w:pPr>
+        <w:pStyle w:val="ListBullet"/>
+        <w:spacing w:after="40"/>
+      </w:pPr>
+      <w:r>
+        <w:rPr>
+          <w:rFonts w:ascii="Calibri" w:hAnsi="Calibri" w:eastAsia="Calibri"/>
+          <w:b w:val="0"/>
+          <w:color w:val="2B2B2B"/>
+          <w:sz w:val="22"/>
+        </w:rPr>
+        <w:t>Todos los integrantes deben poder explicar cualquier parte: en la sustentación las preguntas van al azar a cualquiera.</w:t>
+      </w:r>
+    </w:p>
+    <w:p>
+      <w:pPr>
+        <w:pStyle w:val="ListBullet"/>
+        <w:spacing w:after="40"/>
+      </w:pPr>
+      <w:r>
+        <w:rPr>
+          <w:rFonts w:ascii="Calibri" w:hAnsi="Calibri" w:eastAsia="Calibri"/>
+          <w:b w:val="0"/>
+          <w:color w:val="2B2B2B"/>
+          <w:sz w:val="22"/>
+        </w:rPr>
+        <w:t>Herramientas gratuitas del navegador: draw.io, LabEx Docker Playground o Killercoda y GitHub Actions. Nada de AWS, GCP o Azure con tarjeta, ni instalaciones obligatorias.</w:t>
       </w:r>
     </w:p>
     <w:sectPr>

</xml_diff>